<commit_message>
add:14 adc_code docs:update HAL_API.docs
</commit_message>
<xml_diff>
--- a/HAL_API.docx
+++ b/HAL_API.docx
@@ -1791,125 +1791,2904 @@
           <w:rStyle w:val="HTML1"/>
         </w:rPr>
       </w:pPr>
+    </w:p>
+    <w:p>
+      <w:pPr>
+        <w:pStyle w:val="HTML"/>
+        <w:rPr>
+          <w:rStyle w:val="HTML1"/>
+        </w:rPr>
+      </w:pPr>
+      <w:r>
+        <w:rPr>
+          <w:rStyle w:val="hljs-comment"/>
+        </w:rPr>
+        <w:t>// 示例 2：将定时器3的计数值设置为 1000</w:t>
+      </w:r>
+    </w:p>
+    <w:p>
+      <w:pPr>
+        <w:pStyle w:val="HTML"/>
+        <w:rPr>
+          <w:rStyle w:val="HTML1"/>
+        </w:rPr>
+      </w:pPr>
+      <w:r>
+        <w:rPr>
+          <w:rStyle w:val="HTML1"/>
+        </w:rPr>
+        <w:t xml:space="preserve">__HAL_TIM_SET_COUNTER(&amp;htim3, </w:t>
+      </w:r>
+      <w:r>
+        <w:rPr>
+          <w:rStyle w:val="hljs-number"/>
+        </w:rPr>
+        <w:t>1000</w:t>
+      </w:r>
+      <w:r>
+        <w:rPr>
+          <w:rStyle w:val="HTML1"/>
+        </w:rPr>
+        <w:t>);</w:t>
+      </w:r>
+    </w:p>
+    <w:p>
+      <w:pPr>
+        <w:pStyle w:val="HTML"/>
+        <w:rPr>
+          <w:rStyle w:val="HTML1"/>
+        </w:rPr>
+      </w:pPr>
+    </w:p>
+    <w:p>
+      <w:pPr>
+        <w:pStyle w:val="HTML"/>
+        <w:rPr>
+          <w:rStyle w:val="HTML1"/>
+        </w:rPr>
+      </w:pPr>
+      <w:r>
+        <w:rPr>
+          <w:rStyle w:val="hljs-comment"/>
+        </w:rPr>
+        <w:t>// 综合应用：定时读取编码器增量并清零</w:t>
+      </w:r>
+    </w:p>
+    <w:p>
+      <w:pPr>
+        <w:pStyle w:val="HTML"/>
+        <w:rPr>
+          <w:rStyle w:val="HTML1"/>
+        </w:rPr>
+      </w:pPr>
+      <w:r>
+        <w:rPr>
+          <w:rStyle w:val="hljs-keyword"/>
+        </w:rPr>
+        <w:t>uint32_t</w:t>
+      </w:r>
+      <w:r>
+        <w:rPr>
+          <w:rStyle w:val="HTML1"/>
+        </w:rPr>
+        <w:t xml:space="preserve"> step = __HAL_TIM_GET_COUNTER(&amp;htim2); </w:t>
+      </w:r>
+      <w:r>
+        <w:rPr>
+          <w:rStyle w:val="hljs-comment"/>
+        </w:rPr>
+        <w:t>// 获取过去一段时间的脉冲数</w:t>
+      </w:r>
+    </w:p>
+    <w:p>
+      <w:pPr>
+        <w:pStyle w:val="HTML"/>
+      </w:pPr>
+      <w:r>
+        <w:rPr>
+          <w:rStyle w:val="HTML1"/>
+        </w:rPr>
+        <w:lastRenderedPageBreak/>
+        <w:t xml:space="preserve">__HAL_TIM_SET_COUNTER(&amp;htim2, </w:t>
+      </w:r>
+      <w:r>
+        <w:rPr>
+          <w:rStyle w:val="hljs-number"/>
+        </w:rPr>
+        <w:t>0</w:t>
+      </w:r>
+      <w:r>
+        <w:rPr>
+          <w:rStyle w:val="HTML1"/>
+        </w:rPr>
+        <w:t xml:space="preserve">);              </w:t>
+      </w:r>
+      <w:r>
+        <w:rPr>
+          <w:rStyle w:val="hljs-comment"/>
+        </w:rPr>
+        <w:t>// 获取后立即清零，以便重新开始下一轮计数</w:t>
+      </w:r>
+    </w:p>
+    <w:p/>
+    <w:p/>
+    <w:p>
+      <w:pPr>
+        <w:pStyle w:val="1"/>
+      </w:pPr>
+      <w:r>
+        <w:t>HAL_ADCEx_Calibration_Start()</w:t>
+      </w:r>
+    </w:p>
+    <w:p>
+      <w:pPr>
+        <w:pStyle w:val="ng-star-inserted"/>
+      </w:pPr>
+      <w:r>
+        <w:rPr>
+          <w:rStyle w:val="inline-code"/>
+        </w:rPr>
+        <w:t>HAL_ADCEx_Calibration_Start()</w:t>
+      </w:r>
+      <w:r>
+        <w:rPr>
+          <w:rStyle w:val="ng-star-inserted1"/>
+        </w:rPr>
+        <w:t xml:space="preserve"> 是 STM32 HAL 库中用于</w:t>
+      </w:r>
+      <w:r>
+        <w:rPr>
+          <w:rStyle w:val="ng-star-inserted1"/>
+          <w:b/>
+          <w:bCs/>
+        </w:rPr>
+        <w:t>启动 ADC 硬件自校准</w:t>
+      </w:r>
+      <w:r>
+        <w:rPr>
+          <w:rStyle w:val="ng-star-inserted1"/>
+        </w:rPr>
+        <w:t>的扩展函数。在进行 ADC 采样前调用此函数，可以消除内部的偏移误差，从而显著提高 ADC 的转换精度。</w:t>
+      </w:r>
+    </w:p>
+    <w:p>
+      <w:pPr>
+        <w:pStyle w:val="2"/>
+      </w:pPr>
+      <w:r>
+        <w:rPr>
+          <w:rStyle w:val="ng-star-inserted1"/>
+        </w:rPr>
+        <w:t>函数原型</w:t>
+      </w:r>
+    </w:p>
+    <w:p>
+      <w:pPr>
+        <w:pStyle w:val="ng-star-inserted"/>
+      </w:pPr>
+      <w:r>
+        <w:rPr>
+          <w:rStyle w:val="ng-star-inserted1"/>
+          <w:i/>
+          <w:iCs/>
+        </w:rPr>
+        <w:t>(注意：不同 STM32 系列的参数略有不同)</w:t>
+      </w:r>
+    </w:p>
+    <w:p>
+      <w:pPr>
+        <w:pStyle w:val="HTML"/>
+        <w:rPr>
+          <w:rStyle w:val="HTML1"/>
+        </w:rPr>
+      </w:pPr>
+      <w:r>
+        <w:rPr>
+          <w:rStyle w:val="hljs-comment"/>
+        </w:rPr>
+        <w:t>// 较新型号（如 F3/L4/G4/H7 等）的常见原型：</w:t>
+      </w:r>
+    </w:p>
+    <w:p>
+      <w:pPr>
+        <w:pStyle w:val="HTML"/>
+        <w:rPr>
+          <w:rStyle w:val="HTML1"/>
+        </w:rPr>
+      </w:pPr>
+      <w:r>
+        <w:rPr>
+          <w:rStyle w:val="hljs-function"/>
+        </w:rPr>
+        <w:t xml:space="preserve">HAL_StatusTypeDef </w:t>
+      </w:r>
+      <w:r>
+        <w:rPr>
+          <w:rStyle w:val="hljs-title"/>
+        </w:rPr>
+        <w:t>HAL_ADCEx_Calibration_Start</w:t>
+      </w:r>
+      <w:r>
+        <w:rPr>
+          <w:rStyle w:val="hljs-params"/>
+        </w:rPr>
+        <w:t xml:space="preserve">(ADC_HandleTypeDef *hadc, </w:t>
+      </w:r>
+      <w:r>
+        <w:rPr>
+          <w:rStyle w:val="hljs-keyword"/>
+        </w:rPr>
+        <w:t>uint32_t</w:t>
+      </w:r>
+      <w:r>
+        <w:rPr>
+          <w:rStyle w:val="hljs-params"/>
+        </w:rPr>
+        <w:t xml:space="preserve"> SingleDiff)</w:t>
+      </w:r>
+      <w:r>
+        <w:rPr>
+          <w:rStyle w:val="HTML1"/>
+        </w:rPr>
+        <w:t>;</w:t>
+      </w:r>
+    </w:p>
+    <w:p>
+      <w:pPr>
+        <w:pStyle w:val="HTML"/>
+        <w:rPr>
+          <w:rStyle w:val="HTML1"/>
+        </w:rPr>
+      </w:pPr>
+    </w:p>
+    <w:p>
+      <w:pPr>
+        <w:pStyle w:val="HTML"/>
+        <w:rPr>
+          <w:rStyle w:val="HTML1"/>
+        </w:rPr>
+      </w:pPr>
+      <w:r>
+        <w:rPr>
+          <w:rStyle w:val="hljs-comment"/>
+        </w:rPr>
+        <w:t>// 较老型号（如 F1 系列）的原型：</w:t>
+      </w:r>
+    </w:p>
+    <w:p>
+      <w:pPr>
+        <w:pStyle w:val="HTML"/>
+      </w:pPr>
+      <w:r>
+        <w:rPr>
+          <w:rStyle w:val="hljs-comment"/>
+        </w:rPr>
+        <w:t>// HAL_StatusTypeDef HAL_ADCEx_Calibration_Start(ADC_HandleTypeDef *hadc);</w:t>
+      </w:r>
+    </w:p>
+    <w:p>
+      <w:pPr>
+        <w:pStyle w:val="2"/>
+      </w:pPr>
+      <w:r>
+        <w:rPr>
+          <w:rStyle w:val="ng-star-inserted1"/>
+        </w:rPr>
+        <w:t>参数</w:t>
+      </w:r>
+    </w:p>
+    <w:p>
+      <w:pPr>
+        <w:pStyle w:val="ng-star-inserted"/>
+        <w:numPr>
+          <w:ilvl w:val="0"/>
+          <w:numId w:val="7"/>
+        </w:numPr>
+      </w:pPr>
+      <w:r>
+        <w:rPr>
+          <w:rStyle w:val="inline-code"/>
+          <w:b/>
+          <w:bCs/>
+        </w:rPr>
+        <w:t>hadc</w:t>
+      </w:r>
+      <w:r>
+        <w:rPr>
+          <w:rStyle w:val="ng-star-inserted1"/>
+        </w:rPr>
+        <w:t>: ADC 句柄指针（例如：</w:t>
+      </w:r>
+      <w:r>
+        <w:rPr>
+          <w:rStyle w:val="inline-code"/>
+        </w:rPr>
+        <w:t>&amp;hadc1</w:t>
+      </w:r>
+      <w:r>
+        <w:rPr>
+          <w:rStyle w:val="ng-star-inserted1"/>
+        </w:rPr>
+        <w:t>），代表需要校准的 ADC 外设。</w:t>
+      </w:r>
+    </w:p>
+    <w:p>
+      <w:pPr>
+        <w:pStyle w:val="ng-star-inserted"/>
+        <w:numPr>
+          <w:ilvl w:val="0"/>
+          <w:numId w:val="7"/>
+        </w:numPr>
+      </w:pPr>
+      <w:r>
+        <w:rPr>
+          <w:rStyle w:val="inline-code"/>
+          <w:b/>
+          <w:bCs/>
+        </w:rPr>
+        <w:t>SingleDiff</w:t>
+      </w:r>
+      <w:r>
+        <w:rPr>
+          <w:rStyle w:val="ng-star-inserted1"/>
+        </w:rPr>
+        <w:t xml:space="preserve"> </w:t>
+      </w:r>
+      <w:r>
+        <w:rPr>
+          <w:rStyle w:val="ng-star-inserted1"/>
+          <w:i/>
+          <w:iCs/>
+        </w:rPr>
+        <w:t>(仅新型号有此参数)</w:t>
+      </w:r>
+      <w:r>
+        <w:rPr>
+          <w:rStyle w:val="ng-star-inserted1"/>
+        </w:rPr>
+        <w:t>: 校准的输入模式。可选值：</w:t>
+      </w:r>
+    </w:p>
+    <w:p>
+      <w:pPr>
+        <w:pStyle w:val="ng-star-inserted"/>
+        <w:numPr>
+          <w:ilvl w:val="1"/>
+          <w:numId w:val="7"/>
+        </w:numPr>
+      </w:pPr>
+      <w:r>
+        <w:rPr>
+          <w:rStyle w:val="inline-code"/>
+        </w:rPr>
+        <w:t>ADC_SINGLE_ENDED</w:t>
+      </w:r>
+      <w:r>
+        <w:rPr>
+          <w:rStyle w:val="ng-star-inserted1"/>
+        </w:rPr>
+        <w:t>: 单端输入模式校准（最常用）。</w:t>
+      </w:r>
+    </w:p>
+    <w:p>
+      <w:pPr>
+        <w:pStyle w:val="ng-star-inserted"/>
+        <w:numPr>
+          <w:ilvl w:val="1"/>
+          <w:numId w:val="7"/>
+        </w:numPr>
+      </w:pPr>
+      <w:r>
+        <w:rPr>
+          <w:rStyle w:val="inline-code"/>
+        </w:rPr>
+        <w:t>ADC_DIFFERENTIAL_ENDED</w:t>
+      </w:r>
+      <w:r>
+        <w:rPr>
+          <w:rStyle w:val="ng-star-inserted1"/>
+        </w:rPr>
+        <w:t>: 差分输入模式校准。</w:t>
+      </w:r>
+    </w:p>
+    <w:p>
+      <w:pPr>
+        <w:pStyle w:val="2"/>
+      </w:pPr>
+      <w:r>
+        <w:rPr>
+          <w:rStyle w:val="ng-star-inserted1"/>
+        </w:rPr>
+        <w:t>返回值</w:t>
+      </w:r>
+    </w:p>
+    <w:p>
+      <w:pPr>
+        <w:pStyle w:val="ng-star-inserted"/>
+      </w:pPr>
+      <w:r>
+        <w:rPr>
+          <w:rStyle w:val="ng-star-inserted1"/>
+        </w:rPr>
+        <w:t xml:space="preserve">返回 </w:t>
+      </w:r>
+      <w:r>
+        <w:rPr>
+          <w:rStyle w:val="inline-code"/>
+        </w:rPr>
+        <w:t>HAL_StatusTypeDef</w:t>
+      </w:r>
+      <w:r>
+        <w:rPr>
+          <w:rStyle w:val="ng-star-inserted1"/>
+        </w:rPr>
+        <w:t xml:space="preserve"> 类型的枚举状态：</w:t>
+      </w:r>
+    </w:p>
+    <w:p>
+      <w:pPr>
+        <w:pStyle w:val="ng-star-inserted"/>
+        <w:numPr>
+          <w:ilvl w:val="0"/>
+          <w:numId w:val="8"/>
+        </w:numPr>
+      </w:pPr>
+      <w:r>
+        <w:rPr>
+          <w:rStyle w:val="inline-code"/>
+          <w:b/>
+          <w:bCs/>
+        </w:rPr>
+        <w:t>HAL_OK</w:t>
+      </w:r>
+      <w:r>
+        <w:rPr>
+          <w:rStyle w:val="ng-star-inserted1"/>
+        </w:rPr>
+        <w:t>: 校准成功。</w:t>
+      </w:r>
+    </w:p>
+    <w:p>
+      <w:pPr>
+        <w:pStyle w:val="ng-star-inserted"/>
+        <w:numPr>
+          <w:ilvl w:val="0"/>
+          <w:numId w:val="8"/>
+        </w:numPr>
+      </w:pPr>
+      <w:r>
+        <w:rPr>
+          <w:rStyle w:val="inline-code"/>
+          <w:b/>
+          <w:bCs/>
+        </w:rPr>
+        <w:t>HAL_ERROR</w:t>
+      </w:r>
+      <w:r>
+        <w:rPr>
+          <w:rStyle w:val="ng-star-inserted1"/>
+        </w:rPr>
+        <w:t>: 校准出错（通常是因为 ADC 未处于停止状态）。</w:t>
+      </w:r>
+    </w:p>
+    <w:p>
+      <w:pPr>
+        <w:pStyle w:val="ng-star-inserted"/>
+        <w:numPr>
+          <w:ilvl w:val="0"/>
+          <w:numId w:val="8"/>
+        </w:numPr>
+      </w:pPr>
+      <w:r>
+        <w:rPr>
+          <w:rStyle w:val="inline-code"/>
+          <w:b/>
+          <w:bCs/>
+        </w:rPr>
+        <w:t>HAL_BUSY</w:t>
+      </w:r>
+      <w:r>
+        <w:rPr>
+          <w:rStyle w:val="ng-star-inserted1"/>
+        </w:rPr>
+        <w:t>: ADC 正忙，无法启动校准。</w:t>
+      </w:r>
+    </w:p>
+    <w:p>
+      <w:pPr>
+        <w:pStyle w:val="ng-star-inserted"/>
+        <w:numPr>
+          <w:ilvl w:val="0"/>
+          <w:numId w:val="8"/>
+        </w:numPr>
+      </w:pPr>
+      <w:r>
+        <w:rPr>
+          <w:rStyle w:val="inline-code"/>
+          <w:b/>
+          <w:bCs/>
+        </w:rPr>
+        <w:t>HAL_TIMEOUT</w:t>
+      </w:r>
+      <w:r>
+        <w:rPr>
+          <w:rStyle w:val="ng-star-inserted1"/>
+        </w:rPr>
+        <w:t>: 校准超时。</w:t>
+      </w:r>
+    </w:p>
+    <w:p>
+      <w:pPr>
+        <w:pStyle w:val="2"/>
+      </w:pPr>
+      <w:r>
+        <w:rPr>
+          <w:rStyle w:val="ng-star-inserted1"/>
+        </w:rPr>
+        <w:lastRenderedPageBreak/>
+        <w:t>基本用法</w:t>
+      </w:r>
+    </w:p>
+    <w:p>
+      <w:pPr>
+        <w:pStyle w:val="ng-star-inserted"/>
+      </w:pPr>
+      <w:r>
+        <w:rPr>
+          <w:rStyle w:val="ng-star-inserted1"/>
+        </w:rPr>
+        <w:t>通常在 ADC 硬件初始化完成之后、</w:t>
+      </w:r>
+      <w:r>
+        <w:rPr>
+          <w:rStyle w:val="ng-star-inserted1"/>
+          <w:b/>
+          <w:bCs/>
+        </w:rPr>
+        <w:t xml:space="preserve">正式启动任何 ADC 转换（如 </w:t>
+      </w:r>
+      <w:r>
+        <w:rPr>
+          <w:rStyle w:val="inline-code"/>
+          <w:b/>
+          <w:bCs/>
+        </w:rPr>
+        <w:t>HAL_ADC_Start</w:t>
+      </w:r>
+      <w:r>
+        <w:rPr>
+          <w:rStyle w:val="ng-star-inserted1"/>
+          <w:b/>
+          <w:bCs/>
+        </w:rPr>
+        <w:t>）之前</w:t>
+      </w:r>
+      <w:r>
+        <w:rPr>
+          <w:rStyle w:val="ng-star-inserted1"/>
+        </w:rPr>
+        <w:t>调用一次。</w:t>
+      </w:r>
+    </w:p>
+    <w:p>
+      <w:pPr>
+        <w:pStyle w:val="ng-star-inserted"/>
+      </w:pPr>
+      <w:r>
+        <w:rPr>
+          <w:rStyle w:val="ng-star-inserted1"/>
+          <w:b/>
+          <w:bCs/>
+        </w:rPr>
+        <w:t>示例代码：</w:t>
+      </w:r>
+    </w:p>
+    <w:p>
+      <w:pPr>
+        <w:rPr>
+          <w:rStyle w:val="mat-content"/>
+        </w:rPr>
+      </w:pPr>
+      <w:r>
+        <w:rPr>
+          <w:rStyle w:val="material-symbols-outlined"/>
+        </w:rPr>
+        <w:t xml:space="preserve">code </w:t>
+      </w:r>
+      <w:r>
+        <w:rPr>
+          <w:rStyle w:val="ng-star-inserted1"/>
+        </w:rPr>
+        <w:t>C</w:t>
+      </w:r>
+    </w:p>
+    <w:p>
+      <w:r>
+        <w:rPr>
+          <w:rStyle w:val="material-symbols-outlined"/>
+        </w:rPr>
+        <w:t>downloadcontent_copy</w:t>
+      </w:r>
+    </w:p>
+    <w:p>
+      <w:r>
+        <w:rPr>
+          <w:rStyle w:val="material-symbols-outlined"/>
+        </w:rPr>
+        <w:t>expand_less</w:t>
+      </w:r>
+    </w:p>
+    <w:p>
+      <w:pPr>
+        <w:pStyle w:val="HTML"/>
+        <w:rPr>
+          <w:rStyle w:val="HTML1"/>
+        </w:rPr>
+      </w:pPr>
+      <w:r>
+        <w:rPr>
+          <w:rStyle w:val="hljs-comment"/>
+        </w:rPr>
+        <w:t>// 1. 系统生成的 ADC 初始化</w:t>
+      </w:r>
+    </w:p>
+    <w:p>
+      <w:pPr>
+        <w:pStyle w:val="HTML"/>
+        <w:rPr>
+          <w:rStyle w:val="HTML1"/>
+        </w:rPr>
+      </w:pPr>
+      <w:r>
+        <w:rPr>
+          <w:rStyle w:val="HTML1"/>
+        </w:rPr>
+        <w:t>MX_ADC1_Init();</w:t>
+      </w:r>
+    </w:p>
+    <w:p>
+      <w:pPr>
+        <w:pStyle w:val="HTML"/>
+        <w:rPr>
+          <w:rStyle w:val="HTML1"/>
+        </w:rPr>
+      </w:pPr>
+    </w:p>
+    <w:p>
+      <w:pPr>
+        <w:pStyle w:val="HTML"/>
+        <w:rPr>
+          <w:rStyle w:val="HTML1"/>
+        </w:rPr>
+      </w:pPr>
+      <w:r>
+        <w:rPr>
+          <w:rStyle w:val="hljs-comment"/>
+        </w:rPr>
+        <w:t>// 2. 执行 ADC 自校准（以单端输入模式为例）</w:t>
+      </w:r>
+    </w:p>
+    <w:p>
+      <w:pPr>
+        <w:pStyle w:val="HTML"/>
+        <w:rPr>
+          <w:rStyle w:val="HTML1"/>
+        </w:rPr>
+      </w:pPr>
+      <w:r>
+        <w:rPr>
+          <w:rStyle w:val="hljs-comment"/>
+        </w:rPr>
+        <w:t>// 【注】如果是 STM32F1 系列，代码为: HAL_ADCEx_Calibration_Start(&amp;hadc1);</w:t>
+      </w:r>
+    </w:p>
+    <w:p>
+      <w:pPr>
+        <w:pStyle w:val="HTML"/>
+        <w:rPr>
+          <w:rStyle w:val="HTML1"/>
+        </w:rPr>
+      </w:pPr>
+      <w:r>
+        <w:rPr>
+          <w:rStyle w:val="hljs-keyword"/>
+        </w:rPr>
+        <w:t>if</w:t>
+      </w:r>
+      <w:r>
+        <w:rPr>
+          <w:rStyle w:val="HTML1"/>
+        </w:rPr>
+        <w:t xml:space="preserve"> (HAL_ADCEx_Calibration_Start(&amp;hadc1, ADC_SINGLE_ENDED) != HAL_OK)</w:t>
+      </w:r>
+    </w:p>
+    <w:p>
+      <w:pPr>
+        <w:pStyle w:val="HTML"/>
+        <w:rPr>
+          <w:rStyle w:val="HTML1"/>
+        </w:rPr>
+      </w:pPr>
+      <w:r>
+        <w:rPr>
+          <w:rStyle w:val="HTML1"/>
+        </w:rPr>
+        <w:t>{</w:t>
+      </w:r>
+    </w:p>
+    <w:p>
+      <w:pPr>
+        <w:pStyle w:val="HTML"/>
+        <w:rPr>
+          <w:rStyle w:val="HTML1"/>
+        </w:rPr>
+      </w:pPr>
+      <w:r>
+        <w:rPr>
+          <w:rStyle w:val="HTML1"/>
+        </w:rPr>
+        <w:t xml:space="preserve">    </w:t>
+      </w:r>
+      <w:r>
+        <w:rPr>
+          <w:rStyle w:val="hljs-comment"/>
+        </w:rPr>
+        <w:t>// 校准失败的错误处理</w:t>
+      </w:r>
+    </w:p>
+    <w:p>
+      <w:pPr>
+        <w:pStyle w:val="HTML"/>
+        <w:rPr>
+          <w:rStyle w:val="HTML1"/>
+        </w:rPr>
+      </w:pPr>
+      <w:r>
+        <w:rPr>
+          <w:rStyle w:val="HTML1"/>
+        </w:rPr>
+        <w:t xml:space="preserve">    Error_Handler();</w:t>
+      </w:r>
+    </w:p>
+    <w:p>
+      <w:pPr>
+        <w:pStyle w:val="HTML"/>
+        <w:rPr>
+          <w:rStyle w:val="HTML1"/>
+        </w:rPr>
+      </w:pPr>
+      <w:r>
+        <w:rPr>
+          <w:rStyle w:val="HTML1"/>
+        </w:rPr>
+        <w:t>}</w:t>
+      </w:r>
+    </w:p>
+    <w:p>
+      <w:pPr>
+        <w:pStyle w:val="HTML"/>
+        <w:rPr>
+          <w:rStyle w:val="HTML1"/>
+        </w:rPr>
+      </w:pPr>
+    </w:p>
+    <w:p>
+      <w:pPr>
+        <w:pStyle w:val="HTML"/>
+        <w:rPr>
+          <w:rStyle w:val="HTML1"/>
+        </w:rPr>
+      </w:pPr>
+      <w:r>
+        <w:rPr>
+          <w:rStyle w:val="hljs-comment"/>
+        </w:rPr>
+        <w:t>// 3. 校准完成后，正常启动 ADC</w:t>
+      </w:r>
+    </w:p>
+    <w:p>
+      <w:pPr>
+        <w:pStyle w:val="HTML"/>
+        <w:rPr>
+          <w:rStyle w:val="HTML1"/>
+        </w:rPr>
+      </w:pPr>
+      <w:r>
+        <w:rPr>
+          <w:rStyle w:val="HTML1"/>
+        </w:rPr>
+        <w:t>HAL_ADC_Start(&amp;hadc1);</w:t>
+      </w:r>
+    </w:p>
+    <w:p>
+      <w:pPr>
+        <w:pStyle w:val="HTML"/>
+        <w:rPr>
+          <w:rStyle w:val="HTML1"/>
+        </w:rPr>
+      </w:pPr>
+    </w:p>
+    <w:p>
+      <w:pPr>
+        <w:pStyle w:val="HTML"/>
+        <w:rPr>
+          <w:rStyle w:val="HTML1"/>
+        </w:rPr>
+      </w:pPr>
+      <w:r>
+        <w:rPr>
+          <w:rStyle w:val="hljs-comment"/>
+        </w:rPr>
+        <w:t>// 4. 等待转换并读取数值...</w:t>
+      </w:r>
+    </w:p>
+    <w:p>
+      <w:pPr>
+        <w:pStyle w:val="HTML"/>
+        <w:rPr>
+          <w:rStyle w:val="HTML1"/>
+        </w:rPr>
+      </w:pPr>
+      <w:r>
+        <w:rPr>
+          <w:rStyle w:val="HTML1"/>
+        </w:rPr>
+        <w:t xml:space="preserve">HAL_ADC_PollForConversion(&amp;hadc1, </w:t>
+      </w:r>
+      <w:r>
+        <w:rPr>
+          <w:rStyle w:val="hljs-number"/>
+        </w:rPr>
+        <w:t>100</w:t>
+      </w:r>
+      <w:r>
+        <w:rPr>
+          <w:rStyle w:val="HTML1"/>
+        </w:rPr>
+        <w:t>);</w:t>
+      </w:r>
+    </w:p>
+    <w:p>
+      <w:pPr>
+        <w:pStyle w:val="HTML"/>
+      </w:pPr>
+      <w:r>
+        <w:rPr>
+          <w:rStyle w:val="hljs-keyword"/>
+        </w:rPr>
+        <w:t>uint32_t</w:t>
+      </w:r>
+      <w:r>
+        <w:rPr>
+          <w:rStyle w:val="HTML1"/>
+        </w:rPr>
+        <w:t xml:space="preserve"> adc_value = HAL_ADC_GetValue(&amp;hadc1);</w:t>
+      </w:r>
+    </w:p>
+    <w:p/>
+    <w:p/>
+    <w:p>
+      <w:pPr>
+        <w:pStyle w:val="1"/>
+      </w:pPr>
+      <w:r>
+        <w:t>HAL_ADC_Start()</w:t>
+      </w:r>
+    </w:p>
+    <w:p>
+      <w:pPr>
+        <w:pStyle w:val="ng-star-inserted"/>
+      </w:pPr>
+      <w:r>
+        <w:rPr>
+          <w:rStyle w:val="inline-code"/>
+        </w:rPr>
+        <w:t>HAL_ADC_Start()</w:t>
+      </w:r>
+      <w:r>
+        <w:rPr>
+          <w:rStyle w:val="ng-star-inserted1"/>
+        </w:rPr>
+        <w:t xml:space="preserve"> 是 STM32 HAL 库中用于**开启 ADC 并启动常规通道转换（轮询/普通模式）**的函数。</w:t>
+      </w:r>
+    </w:p>
+    <w:p>
+      <w:pPr>
+        <w:pStyle w:val="2"/>
+      </w:pPr>
+      <w:r>
+        <w:rPr>
+          <w:rStyle w:val="ng-star-inserted1"/>
+        </w:rPr>
+        <w:t>函数原型</w:t>
+      </w:r>
+    </w:p>
+    <w:p>
+      <w:pPr>
+        <w:rPr>
+          <w:rStyle w:val="mat-content"/>
+        </w:rPr>
+      </w:pPr>
+      <w:r>
+        <w:rPr>
+          <w:rStyle w:val="material-symbols-outlined"/>
+        </w:rPr>
+        <w:t xml:space="preserve">code </w:t>
+      </w:r>
+      <w:r>
+        <w:rPr>
+          <w:rStyle w:val="ng-star-inserted1"/>
+        </w:rPr>
+        <w:t>C</w:t>
+      </w:r>
+    </w:p>
+    <w:p>
+      <w:r>
+        <w:rPr>
+          <w:rStyle w:val="material-symbols-outlined"/>
+        </w:rPr>
+        <w:t>downloadcontent_copy</w:t>
+      </w:r>
+    </w:p>
+    <w:p>
+      <w:r>
+        <w:rPr>
+          <w:rStyle w:val="material-symbols-outlined"/>
+        </w:rPr>
+        <w:t>expand_less</w:t>
+      </w:r>
+    </w:p>
+    <w:p>
+      <w:pPr>
+        <w:pStyle w:val="HTML"/>
+      </w:pPr>
+      <w:r>
+        <w:rPr>
+          <w:rStyle w:val="hljs-function"/>
+        </w:rPr>
+        <w:lastRenderedPageBreak/>
+        <w:t xml:space="preserve">HAL_StatusTypeDef </w:t>
+      </w:r>
+      <w:r>
+        <w:rPr>
+          <w:rStyle w:val="hljs-title"/>
+        </w:rPr>
+        <w:t>HAL_ADC_Start</w:t>
+      </w:r>
+      <w:r>
+        <w:rPr>
+          <w:rStyle w:val="hljs-params"/>
+        </w:rPr>
+        <w:t>(ADC_HandleTypeDef *hadc)</w:t>
+      </w:r>
+      <w:r>
+        <w:rPr>
+          <w:rStyle w:val="HTML1"/>
+        </w:rPr>
+        <w:t>;</w:t>
+      </w:r>
+    </w:p>
+    <w:p>
+      <w:pPr>
+        <w:pStyle w:val="2"/>
+      </w:pPr>
+      <w:r>
+        <w:rPr>
+          <w:rStyle w:val="ng-star-inserted1"/>
+        </w:rPr>
+        <w:t>参数</w:t>
+      </w:r>
+    </w:p>
+    <w:p>
+      <w:pPr>
+        <w:pStyle w:val="ng-star-inserted"/>
+        <w:numPr>
+          <w:ilvl w:val="0"/>
+          <w:numId w:val="9"/>
+        </w:numPr>
+      </w:pPr>
+      <w:r>
+        <w:rPr>
+          <w:rStyle w:val="inline-code"/>
+          <w:b/>
+          <w:bCs/>
+        </w:rPr>
+        <w:t>hadc</w:t>
+      </w:r>
+      <w:r>
+        <w:rPr>
+          <w:rStyle w:val="ng-star-inserted1"/>
+        </w:rPr>
+        <w:t>: ADC 句柄指针（例如：</w:t>
+      </w:r>
+      <w:r>
+        <w:rPr>
+          <w:rStyle w:val="inline-code"/>
+        </w:rPr>
+        <w:t>&amp;hadc1</w:t>
+      </w:r>
+      <w:r>
+        <w:rPr>
+          <w:rStyle w:val="ng-star-inserted1"/>
+        </w:rPr>
+        <w:t>、</w:t>
+      </w:r>
+      <w:r>
+        <w:rPr>
+          <w:rStyle w:val="inline-code"/>
+        </w:rPr>
+        <w:t>&amp;hadc2</w:t>
+      </w:r>
+      <w:r>
+        <w:rPr>
+          <w:rStyle w:val="ng-star-inserted1"/>
+        </w:rPr>
+        <w:t>），代表你要启动的那个 ADC 外设。</w:t>
+      </w:r>
+    </w:p>
+    <w:p>
+      <w:pPr>
+        <w:pStyle w:val="2"/>
+      </w:pPr>
+      <w:r>
+        <w:rPr>
+          <w:rStyle w:val="ng-star-inserted1"/>
+        </w:rPr>
+        <w:t>返回值</w:t>
+      </w:r>
+    </w:p>
+    <w:p>
+      <w:pPr>
+        <w:pStyle w:val="ng-star-inserted"/>
+      </w:pPr>
+      <w:r>
+        <w:rPr>
+          <w:rStyle w:val="ng-star-inserted1"/>
+        </w:rPr>
+        <w:t xml:space="preserve">返回 </w:t>
+      </w:r>
+      <w:r>
+        <w:rPr>
+          <w:rStyle w:val="inline-code"/>
+        </w:rPr>
+        <w:t>HAL_StatusTypeDef</w:t>
+      </w:r>
+      <w:r>
+        <w:rPr>
+          <w:rStyle w:val="ng-star-inserted1"/>
+        </w:rPr>
+        <w:t xml:space="preserve"> 类型的枚举状态：</w:t>
+      </w:r>
+    </w:p>
+    <w:p>
+      <w:pPr>
+        <w:pStyle w:val="ng-star-inserted"/>
+        <w:numPr>
+          <w:ilvl w:val="0"/>
+          <w:numId w:val="10"/>
+        </w:numPr>
+      </w:pPr>
+      <w:r>
+        <w:rPr>
+          <w:rStyle w:val="inline-code"/>
+          <w:b/>
+          <w:bCs/>
+        </w:rPr>
+        <w:t>HAL_OK</w:t>
+      </w:r>
+      <w:r>
+        <w:rPr>
+          <w:rStyle w:val="ng-star-inserted1"/>
+        </w:rPr>
+        <w:t>: 启动成功。</w:t>
+      </w:r>
+    </w:p>
+    <w:p>
+      <w:pPr>
+        <w:pStyle w:val="ng-star-inserted"/>
+        <w:numPr>
+          <w:ilvl w:val="0"/>
+          <w:numId w:val="10"/>
+        </w:numPr>
+      </w:pPr>
+      <w:r>
+        <w:rPr>
+          <w:rStyle w:val="inline-code"/>
+          <w:b/>
+          <w:bCs/>
+        </w:rPr>
+        <w:t>HAL_ERROR</w:t>
+      </w:r>
+      <w:r>
+        <w:rPr>
+          <w:rStyle w:val="ng-star-inserted1"/>
+        </w:rPr>
+        <w:t>: 配置错误或底层出错。</w:t>
+      </w:r>
+    </w:p>
+    <w:p>
+      <w:pPr>
+        <w:pStyle w:val="ng-star-inserted"/>
+        <w:numPr>
+          <w:ilvl w:val="0"/>
+          <w:numId w:val="10"/>
+        </w:numPr>
+      </w:pPr>
+      <w:r>
+        <w:rPr>
+          <w:rStyle w:val="inline-code"/>
+          <w:b/>
+          <w:bCs/>
+        </w:rPr>
+        <w:t>HAL_BUSY</w:t>
+      </w:r>
+      <w:r>
+        <w:rPr>
+          <w:rStyle w:val="ng-star-inserted1"/>
+        </w:rPr>
+        <w:t>: ADC 正在使用中（例如已经在进行转换）。</w:t>
+      </w:r>
+    </w:p>
+    <w:p>
+      <w:pPr>
+        <w:pStyle w:val="ng-star-inserted"/>
+        <w:numPr>
+          <w:ilvl w:val="0"/>
+          <w:numId w:val="10"/>
+        </w:numPr>
+      </w:pPr>
+      <w:r>
+        <w:rPr>
+          <w:rStyle w:val="inline-code"/>
+          <w:b/>
+          <w:bCs/>
+        </w:rPr>
+        <w:t>HAL_TIMEOUT</w:t>
+      </w:r>
+      <w:r>
+        <w:rPr>
+          <w:rStyle w:val="ng-star-inserted1"/>
+        </w:rPr>
+        <w:t>: 启动超时。</w:t>
+      </w:r>
+    </w:p>
+    <w:p>
+      <w:pPr>
+        <w:pStyle w:val="2"/>
+      </w:pPr>
+      <w:r>
+        <w:rPr>
+          <w:rStyle w:val="ng-star-inserted1"/>
+        </w:rPr>
+        <w:t>基本用法</w:t>
+      </w:r>
+    </w:p>
+    <w:p>
+      <w:pPr>
+        <w:pStyle w:val="ng-star-inserted"/>
+      </w:pPr>
+      <w:r>
+        <w:rPr>
+          <w:rStyle w:val="ng-star-inserted1"/>
+        </w:rPr>
+        <w:t>常用于最基础的</w:t>
+      </w:r>
+      <w:r>
+        <w:rPr>
+          <w:rStyle w:val="ng-star-inserted1"/>
+          <w:b/>
+          <w:bCs/>
+        </w:rPr>
+        <w:t>轮询（阻塞）模式</w:t>
+      </w:r>
+      <w:r>
+        <w:rPr>
+          <w:rStyle w:val="ng-star-inserted1"/>
+        </w:rPr>
+        <w:t xml:space="preserve">读取 ADC 数据。一般需要配合 </w:t>
+      </w:r>
+      <w:r>
+        <w:rPr>
+          <w:rStyle w:val="inline-code"/>
+        </w:rPr>
+        <w:t>HAL_ADC_PollForConversion()</w:t>
+      </w:r>
+      <w:r>
+        <w:rPr>
+          <w:rStyle w:val="ng-star-inserted1"/>
+        </w:rPr>
+        <w:t xml:space="preserve"> （等待转换完成）和 </w:t>
+      </w:r>
+      <w:r>
+        <w:rPr>
+          <w:rStyle w:val="inline-code"/>
+        </w:rPr>
+        <w:t>HAL_ADC_GetValue()</w:t>
+      </w:r>
+      <w:r>
+        <w:rPr>
+          <w:rStyle w:val="ng-star-inserted1"/>
+        </w:rPr>
+        <w:t xml:space="preserve"> （获取转换结果）一起使用。</w:t>
+      </w:r>
+    </w:p>
+    <w:p>
+      <w:pPr>
+        <w:pStyle w:val="ng-star-inserted"/>
+      </w:pPr>
+      <w:r>
+        <w:rPr>
+          <w:rStyle w:val="ng-star-inserted1"/>
+          <w:b/>
+          <w:bCs/>
+        </w:rPr>
+        <w:t>示例代码：</w:t>
+      </w:r>
+    </w:p>
+    <w:p>
+      <w:pPr>
+        <w:rPr>
+          <w:rStyle w:val="mat-content"/>
+        </w:rPr>
+      </w:pPr>
+      <w:r>
+        <w:rPr>
+          <w:rStyle w:val="material-symbols-outlined"/>
+        </w:rPr>
+        <w:t xml:space="preserve">code </w:t>
+      </w:r>
+      <w:r>
+        <w:rPr>
+          <w:rStyle w:val="ng-star-inserted1"/>
+        </w:rPr>
+        <w:t>C</w:t>
+      </w:r>
+    </w:p>
+    <w:p>
+      <w:r>
+        <w:rPr>
+          <w:rStyle w:val="material-symbols-outlined"/>
+        </w:rPr>
+        <w:t>downloadcontent_copy</w:t>
+      </w:r>
+    </w:p>
+    <w:p>
+      <w:r>
+        <w:rPr>
+          <w:rStyle w:val="material-symbols-outlined"/>
+        </w:rPr>
+        <w:t>expand_less</w:t>
+      </w:r>
+    </w:p>
+    <w:p>
+      <w:pPr>
+        <w:pStyle w:val="HTML"/>
+        <w:rPr>
+          <w:rStyle w:val="HTML1"/>
+        </w:rPr>
+      </w:pPr>
+      <w:r>
+        <w:rPr>
+          <w:rStyle w:val="hljs-keyword"/>
+        </w:rPr>
+        <w:t>uint32_t</w:t>
+      </w:r>
+      <w:r>
+        <w:rPr>
+          <w:rStyle w:val="HTML1"/>
+        </w:rPr>
+        <w:t xml:space="preserve"> adc_value = </w:t>
+      </w:r>
+      <w:r>
+        <w:rPr>
+          <w:rStyle w:val="hljs-number"/>
+        </w:rPr>
+        <w:t>0</w:t>
+      </w:r>
+      <w:r>
+        <w:rPr>
+          <w:rStyle w:val="HTML1"/>
+        </w:rPr>
+        <w:t>;</w:t>
+      </w:r>
+    </w:p>
+    <w:p>
+      <w:pPr>
+        <w:pStyle w:val="HTML"/>
+        <w:rPr>
+          <w:rStyle w:val="HTML1"/>
+        </w:rPr>
+      </w:pPr>
+    </w:p>
+    <w:p>
+      <w:pPr>
+        <w:pStyle w:val="HTML"/>
+        <w:rPr>
+          <w:rStyle w:val="HTML1"/>
+        </w:rPr>
+      </w:pPr>
+      <w:r>
+        <w:rPr>
+          <w:rStyle w:val="hljs-comment"/>
+        </w:rPr>
+        <w:t>// 1. 启动 ADC 转换</w:t>
+      </w:r>
+    </w:p>
+    <w:p>
+      <w:pPr>
+        <w:pStyle w:val="HTML"/>
+        <w:rPr>
+          <w:rStyle w:val="HTML1"/>
+        </w:rPr>
+      </w:pPr>
+      <w:r>
+        <w:rPr>
+          <w:rStyle w:val="HTML1"/>
+        </w:rPr>
+        <w:t>HAL_ADC_Start(&amp;hadc1);</w:t>
+      </w:r>
+    </w:p>
+    <w:p>
+      <w:pPr>
+        <w:pStyle w:val="HTML"/>
+        <w:rPr>
+          <w:rStyle w:val="HTML1"/>
+        </w:rPr>
+      </w:pPr>
+    </w:p>
+    <w:p>
+      <w:pPr>
+        <w:pStyle w:val="HTML"/>
+        <w:rPr>
+          <w:rStyle w:val="HTML1"/>
+        </w:rPr>
+      </w:pPr>
+      <w:r>
+        <w:rPr>
+          <w:rStyle w:val="hljs-comment"/>
+        </w:rPr>
+        <w:t>// 2. 等待 ADC 转换完成（超时时间设为 100ms）</w:t>
+      </w:r>
+    </w:p>
+    <w:p>
+      <w:pPr>
+        <w:pStyle w:val="HTML"/>
+        <w:rPr>
+          <w:rStyle w:val="HTML1"/>
+        </w:rPr>
+      </w:pPr>
+      <w:r>
+        <w:rPr>
+          <w:rStyle w:val="hljs-keyword"/>
+        </w:rPr>
+        <w:t>if</w:t>
+      </w:r>
+      <w:r>
+        <w:rPr>
+          <w:rStyle w:val="HTML1"/>
+        </w:rPr>
+        <w:t xml:space="preserve"> (HAL_ADC_PollForConversion(&amp;hadc1, </w:t>
+      </w:r>
+      <w:r>
+        <w:rPr>
+          <w:rStyle w:val="hljs-number"/>
+        </w:rPr>
+        <w:t>100</w:t>
+      </w:r>
+      <w:r>
+        <w:rPr>
+          <w:rStyle w:val="HTML1"/>
+        </w:rPr>
+        <w:t>) == HAL_OK)</w:t>
+      </w:r>
+    </w:p>
+    <w:p>
+      <w:pPr>
+        <w:pStyle w:val="HTML"/>
+        <w:rPr>
+          <w:rStyle w:val="HTML1"/>
+        </w:rPr>
+      </w:pPr>
+      <w:r>
+        <w:rPr>
+          <w:rStyle w:val="HTML1"/>
+        </w:rPr>
+        <w:t>{</w:t>
+      </w:r>
+    </w:p>
+    <w:p>
+      <w:pPr>
+        <w:pStyle w:val="HTML"/>
+        <w:rPr>
+          <w:rStyle w:val="HTML1"/>
+        </w:rPr>
+      </w:pPr>
+      <w:r>
+        <w:rPr>
+          <w:rStyle w:val="HTML1"/>
+        </w:rPr>
+        <w:t xml:space="preserve">    </w:t>
+      </w:r>
+      <w:r>
+        <w:rPr>
+          <w:rStyle w:val="hljs-comment"/>
+        </w:rPr>
+        <w:t>// 3. 读取 ADC 转换结果</w:t>
+      </w:r>
+    </w:p>
+    <w:p>
+      <w:pPr>
+        <w:pStyle w:val="HTML"/>
+        <w:rPr>
+          <w:rStyle w:val="HTML1"/>
+        </w:rPr>
+      </w:pPr>
+      <w:r>
+        <w:rPr>
+          <w:rStyle w:val="HTML1"/>
+        </w:rPr>
+        <w:t xml:space="preserve">    adc_value = HAL_ADC_GetValue(&amp;hadc1);</w:t>
+      </w:r>
+    </w:p>
+    <w:p>
+      <w:pPr>
+        <w:pStyle w:val="HTML"/>
+        <w:rPr>
+          <w:rStyle w:val="HTML1"/>
+        </w:rPr>
+      </w:pPr>
+      <w:r>
+        <w:rPr>
+          <w:rStyle w:val="HTML1"/>
+        </w:rPr>
+        <w:t>}</w:t>
+      </w:r>
+    </w:p>
+    <w:p>
+      <w:pPr>
+        <w:pStyle w:val="HTML"/>
+        <w:rPr>
+          <w:rStyle w:val="HTML1"/>
+        </w:rPr>
+      </w:pPr>
+    </w:p>
+    <w:p>
+      <w:pPr>
+        <w:pStyle w:val="HTML"/>
+        <w:rPr>
+          <w:rStyle w:val="HTML1"/>
+        </w:rPr>
+      </w:pPr>
+      <w:r>
+        <w:rPr>
+          <w:rStyle w:val="hljs-comment"/>
+        </w:rPr>
+        <w:t>// (可选) 停止 ADC，降低功耗</w:t>
+      </w:r>
+    </w:p>
+    <w:p>
+      <w:pPr>
+        <w:pStyle w:val="HTML"/>
+      </w:pPr>
+      <w:r>
+        <w:rPr>
+          <w:rStyle w:val="hljs-comment"/>
+        </w:rPr>
+        <w:t>// HAL_ADC_Stop(&amp;hadc1);</w:t>
+      </w:r>
+    </w:p>
+    <w:p>
+      <w:pPr>
+        <w:pStyle w:val="1"/>
+      </w:pPr>
+      <w:r>
+        <w:lastRenderedPageBreak/>
+        <w:t>HAL_ADC_PollForConversion()</w:t>
+      </w:r>
+    </w:p>
+    <w:p>
+      <w:pPr>
+        <w:pStyle w:val="ng-star-inserted"/>
+      </w:pPr>
+      <w:r>
+        <w:rPr>
+          <w:rStyle w:val="inline-code"/>
+        </w:rPr>
+        <w:t>HAL_ADC_PollForConversion()</w:t>
+      </w:r>
+      <w:r>
+        <w:rPr>
+          <w:rStyle w:val="ng-star-inserted1"/>
+        </w:rPr>
+        <w:t xml:space="preserve"> 是 STM32 HAL 库中用于</w:t>
+      </w:r>
+      <w:r>
+        <w:rPr>
+          <w:rStyle w:val="ng-star-inserted1"/>
+          <w:b/>
+          <w:bCs/>
+        </w:rPr>
+        <w:t>等待（阻塞）ADC 常规通道转换完成</w:t>
+      </w:r>
+      <w:r>
+        <w:rPr>
+          <w:rStyle w:val="ng-star-inserted1"/>
+        </w:rPr>
+        <w:t>的函数。它通常在轮询模式下使用。</w:t>
+      </w:r>
+    </w:p>
+    <w:p>
+      <w:pPr>
+        <w:pStyle w:val="2"/>
+      </w:pPr>
+      <w:r>
+        <w:rPr>
+          <w:rStyle w:val="ng-star-inserted1"/>
+        </w:rPr>
+        <w:t>函数原型</w:t>
+      </w:r>
+    </w:p>
+    <w:p>
+      <w:pPr>
+        <w:rPr>
+          <w:rStyle w:val="mat-content"/>
+        </w:rPr>
+      </w:pPr>
+      <w:r>
+        <w:rPr>
+          <w:rStyle w:val="material-symbols-outlined"/>
+        </w:rPr>
+        <w:t xml:space="preserve">code </w:t>
+      </w:r>
+      <w:r>
+        <w:rPr>
+          <w:rStyle w:val="ng-star-inserted1"/>
+        </w:rPr>
+        <w:t>C</w:t>
+      </w:r>
+    </w:p>
+    <w:p>
+      <w:r>
+        <w:rPr>
+          <w:rStyle w:val="material-symbols-outlined"/>
+        </w:rPr>
+        <w:t>downloadcontent_copy</w:t>
+      </w:r>
+    </w:p>
+    <w:p>
+      <w:r>
+        <w:rPr>
+          <w:rStyle w:val="material-symbols-outlined"/>
+        </w:rPr>
+        <w:t>expand_less</w:t>
+      </w:r>
+    </w:p>
+    <w:p>
+      <w:pPr>
+        <w:pStyle w:val="HTML"/>
+      </w:pPr>
+      <w:r>
+        <w:rPr>
+          <w:rStyle w:val="hljs-function"/>
+        </w:rPr>
+        <w:t xml:space="preserve">HAL_StatusTypeDef </w:t>
+      </w:r>
+      <w:r>
+        <w:rPr>
+          <w:rStyle w:val="hljs-title"/>
+        </w:rPr>
+        <w:t>HAL_ADC_PollForConversion</w:t>
+      </w:r>
+      <w:r>
+        <w:rPr>
+          <w:rStyle w:val="hljs-params"/>
+        </w:rPr>
+        <w:t xml:space="preserve">(ADC_HandleTypeDef *hadc, </w:t>
+      </w:r>
+      <w:r>
+        <w:rPr>
+          <w:rStyle w:val="hljs-keyword"/>
+        </w:rPr>
+        <w:t>uint32_t</w:t>
+      </w:r>
+      <w:r>
+        <w:rPr>
+          <w:rStyle w:val="hljs-params"/>
+        </w:rPr>
+        <w:t xml:space="preserve"> Timeout)</w:t>
+      </w:r>
+      <w:r>
+        <w:rPr>
+          <w:rStyle w:val="HTML1"/>
+        </w:rPr>
+        <w:t>;</w:t>
+      </w:r>
+    </w:p>
+    <w:p>
+      <w:pPr>
+        <w:pStyle w:val="2"/>
+      </w:pPr>
+      <w:r>
+        <w:rPr>
+          <w:rStyle w:val="ng-star-inserted1"/>
+        </w:rPr>
+        <w:t>参数</w:t>
+      </w:r>
+    </w:p>
+    <w:p>
+      <w:pPr>
+        <w:pStyle w:val="ng-star-inserted"/>
+        <w:numPr>
+          <w:ilvl w:val="0"/>
+          <w:numId w:val="11"/>
+        </w:numPr>
+      </w:pPr>
+      <w:r>
+        <w:rPr>
+          <w:rStyle w:val="inline-code"/>
+          <w:b/>
+          <w:bCs/>
+        </w:rPr>
+        <w:t>hadc</w:t>
+      </w:r>
+      <w:r>
+        <w:rPr>
+          <w:rStyle w:val="ng-star-inserted1"/>
+        </w:rPr>
+        <w:t>: ADC 句柄指针（例如：</w:t>
+      </w:r>
+      <w:r>
+        <w:rPr>
+          <w:rStyle w:val="inline-code"/>
+        </w:rPr>
+        <w:t>&amp;hadc1</w:t>
+      </w:r>
+      <w:r>
+        <w:rPr>
+          <w:rStyle w:val="ng-star-inserted1"/>
+        </w:rPr>
+        <w:t>），代表正在进行转换的 ADC 外设。</w:t>
+      </w:r>
+    </w:p>
+    <w:p>
+      <w:pPr>
+        <w:pStyle w:val="ng-star-inserted"/>
+        <w:numPr>
+          <w:ilvl w:val="0"/>
+          <w:numId w:val="11"/>
+        </w:numPr>
+      </w:pPr>
+      <w:r>
+        <w:rPr>
+          <w:rStyle w:val="inline-code"/>
+          <w:b/>
+          <w:bCs/>
+        </w:rPr>
+        <w:t>Timeout</w:t>
+      </w:r>
+      <w:r>
+        <w:rPr>
+          <w:rStyle w:val="ng-star-inserted1"/>
+        </w:rPr>
+        <w:t xml:space="preserve">: 超时时间（单位：毫秒 ms）。如果在指定时间内转换未完成，函数将退出并返回超时。若想无限等待，可传入宏 </w:t>
+      </w:r>
+      <w:r>
+        <w:rPr>
+          <w:rStyle w:val="inline-code"/>
+        </w:rPr>
+        <w:t>HAL_MAX_DELAY</w:t>
+      </w:r>
+      <w:r>
+        <w:rPr>
+          <w:rStyle w:val="ng-star-inserted1"/>
+        </w:rPr>
+        <w:t>（即 0xFFFFFFFF）。</w:t>
+      </w:r>
+    </w:p>
+    <w:p>
+      <w:pPr>
+        <w:pStyle w:val="2"/>
+      </w:pPr>
+      <w:r>
+        <w:rPr>
+          <w:rStyle w:val="ng-star-inserted1"/>
+        </w:rPr>
+        <w:t>返回值</w:t>
+      </w:r>
+    </w:p>
+    <w:p>
+      <w:pPr>
+        <w:pStyle w:val="ng-star-inserted"/>
+      </w:pPr>
+      <w:r>
+        <w:rPr>
+          <w:rStyle w:val="ng-star-inserted1"/>
+        </w:rPr>
+        <w:t xml:space="preserve">返回 </w:t>
+      </w:r>
+      <w:r>
+        <w:rPr>
+          <w:rStyle w:val="inline-code"/>
+        </w:rPr>
+        <w:t>HAL_StatusTypeDef</w:t>
+      </w:r>
+      <w:r>
+        <w:rPr>
+          <w:rStyle w:val="ng-star-inserted1"/>
+        </w:rPr>
+        <w:t xml:space="preserve"> 类型的枚举状态：</w:t>
+      </w:r>
+    </w:p>
+    <w:p>
+      <w:pPr>
+        <w:pStyle w:val="ng-star-inserted"/>
+        <w:numPr>
+          <w:ilvl w:val="0"/>
+          <w:numId w:val="12"/>
+        </w:numPr>
+      </w:pPr>
+      <w:r>
+        <w:rPr>
+          <w:rStyle w:val="inline-code"/>
+          <w:b/>
+          <w:bCs/>
+        </w:rPr>
+        <w:t>HAL_OK</w:t>
+      </w:r>
+      <w:r>
+        <w:rPr>
+          <w:rStyle w:val="ng-star-inserted1"/>
+        </w:rPr>
+        <w:t>: 转换成功完成，现在可以读取数据了。</w:t>
+      </w:r>
+    </w:p>
+    <w:p>
+      <w:pPr>
+        <w:pStyle w:val="ng-star-inserted"/>
+        <w:numPr>
+          <w:ilvl w:val="0"/>
+          <w:numId w:val="12"/>
+        </w:numPr>
+      </w:pPr>
+      <w:r>
+        <w:rPr>
+          <w:rStyle w:val="inline-code"/>
+          <w:b/>
+          <w:bCs/>
+        </w:rPr>
+        <w:t>HAL_TIMEOUT</w:t>
+      </w:r>
+      <w:r>
+        <w:rPr>
+          <w:rStyle w:val="ng-star-inserted1"/>
+        </w:rPr>
+        <w:t>: 在规定的超时时间内，转换未能完成。</w:t>
+      </w:r>
+    </w:p>
+    <w:p>
+      <w:pPr>
+        <w:pStyle w:val="ng-star-inserted"/>
+        <w:numPr>
+          <w:ilvl w:val="0"/>
+          <w:numId w:val="12"/>
+        </w:numPr>
+      </w:pPr>
+      <w:r>
+        <w:rPr>
+          <w:rStyle w:val="inline-code"/>
+          <w:b/>
+          <w:bCs/>
+        </w:rPr>
+        <w:t>HAL_ERROR</w:t>
+      </w:r>
+      <w:r>
+        <w:rPr>
+          <w:rStyle w:val="ng-star-inserted1"/>
+        </w:rPr>
+        <w:t>: ADC 状态异常或配置错误。</w:t>
+      </w:r>
+    </w:p>
+    <w:p>
+      <w:pPr>
+        <w:pStyle w:val="2"/>
+      </w:pPr>
+      <w:r>
+        <w:rPr>
+          <w:rStyle w:val="ng-star-inserted1"/>
+        </w:rPr>
+        <w:t>基本用法</w:t>
+      </w:r>
+    </w:p>
+    <w:p>
+      <w:pPr>
+        <w:pStyle w:val="ng-star-inserted"/>
+      </w:pPr>
+      <w:r>
+        <w:rPr>
+          <w:rStyle w:val="ng-star-inserted1"/>
+        </w:rPr>
+        <w:t xml:space="preserve">常用于轮询模式，必须放在 </w:t>
+      </w:r>
+      <w:r>
+        <w:rPr>
+          <w:rStyle w:val="inline-code"/>
+        </w:rPr>
+        <w:t>HAL_ADC_Start()</w:t>
+      </w:r>
+      <w:r>
+        <w:rPr>
+          <w:rStyle w:val="ng-star-inserted1"/>
+        </w:rPr>
+        <w:t xml:space="preserve"> 之后，并在 </w:t>
+      </w:r>
+      <w:r>
+        <w:rPr>
+          <w:rStyle w:val="inline-code"/>
+        </w:rPr>
+        <w:t>HAL_ADC_GetValue()</w:t>
+      </w:r>
+      <w:r>
+        <w:rPr>
+          <w:rStyle w:val="ng-star-inserted1"/>
+        </w:rPr>
+        <w:t xml:space="preserve"> 之前调用，以确保读取到的数据是最新且有效的。</w:t>
+      </w:r>
+    </w:p>
+    <w:p>
+      <w:pPr>
+        <w:pStyle w:val="ng-star-inserted"/>
+      </w:pPr>
+      <w:r>
+        <w:rPr>
+          <w:rStyle w:val="ng-star-inserted1"/>
+          <w:b/>
+          <w:bCs/>
+        </w:rPr>
+        <w:t>示例代码：</w:t>
+      </w:r>
+    </w:p>
+    <w:p>
+      <w:pPr>
+        <w:rPr>
+          <w:rStyle w:val="mat-content"/>
+        </w:rPr>
+      </w:pPr>
+      <w:r>
+        <w:rPr>
+          <w:rStyle w:val="material-symbols-outlined"/>
+        </w:rPr>
+        <w:t xml:space="preserve">code </w:t>
+      </w:r>
+      <w:r>
+        <w:rPr>
+          <w:rStyle w:val="ng-star-inserted1"/>
+        </w:rPr>
+        <w:t>C</w:t>
+      </w:r>
+    </w:p>
+    <w:p>
+      <w:r>
+        <w:rPr>
+          <w:rStyle w:val="material-symbols-outlined"/>
+        </w:rPr>
+        <w:t>downloadcontent_copy</w:t>
+      </w:r>
+    </w:p>
+    <w:p>
+      <w:r>
+        <w:rPr>
+          <w:rStyle w:val="material-symbols-outlined"/>
+        </w:rPr>
+        <w:t>expand_less</w:t>
+      </w:r>
+    </w:p>
+    <w:p>
+      <w:pPr>
+        <w:pStyle w:val="HTML"/>
+        <w:rPr>
+          <w:rStyle w:val="HTML1"/>
+        </w:rPr>
+      </w:pPr>
+      <w:r>
+        <w:rPr>
+          <w:rStyle w:val="hljs-keyword"/>
+        </w:rPr>
+        <w:t>uint32_t</w:t>
+      </w:r>
+      <w:r>
+        <w:rPr>
+          <w:rStyle w:val="HTML1"/>
+        </w:rPr>
+        <w:t xml:space="preserve"> adc_value = </w:t>
+      </w:r>
+      <w:r>
+        <w:rPr>
+          <w:rStyle w:val="hljs-number"/>
+        </w:rPr>
+        <w:t>0</w:t>
+      </w:r>
+      <w:r>
+        <w:rPr>
+          <w:rStyle w:val="HTML1"/>
+        </w:rPr>
+        <w:t>;</w:t>
+      </w:r>
+    </w:p>
+    <w:p>
+      <w:pPr>
+        <w:pStyle w:val="HTML"/>
+        <w:rPr>
+          <w:rStyle w:val="HTML1"/>
+        </w:rPr>
+      </w:pPr>
+    </w:p>
+    <w:p>
+      <w:pPr>
+        <w:pStyle w:val="HTML"/>
+        <w:rPr>
+          <w:rStyle w:val="HTML1"/>
+        </w:rPr>
+      </w:pPr>
+      <w:r>
+        <w:rPr>
+          <w:rStyle w:val="hljs-comment"/>
+        </w:rPr>
+        <w:t>// 1. 启动 ADC 转换</w:t>
+      </w:r>
+    </w:p>
+    <w:p>
+      <w:pPr>
+        <w:pStyle w:val="HTML"/>
+        <w:rPr>
+          <w:rStyle w:val="HTML1"/>
+        </w:rPr>
+      </w:pPr>
+      <w:r>
+        <w:rPr>
+          <w:rStyle w:val="HTML1"/>
+        </w:rPr>
+        <w:t>HAL_ADC_Start(&amp;hadc1);</w:t>
+      </w:r>
+    </w:p>
+    <w:p>
+      <w:pPr>
+        <w:pStyle w:val="HTML"/>
+        <w:rPr>
+          <w:rStyle w:val="HTML1"/>
+        </w:rPr>
+      </w:pPr>
+    </w:p>
+    <w:p>
+      <w:pPr>
+        <w:pStyle w:val="HTML"/>
+        <w:rPr>
+          <w:rStyle w:val="HTML1"/>
+        </w:rPr>
+      </w:pPr>
+      <w:r>
+        <w:rPr>
+          <w:rStyle w:val="hljs-comment"/>
+        </w:rPr>
+        <w:t>// 2. 等待转换完成，最大等待时间设为 10 毫秒</w:t>
+      </w:r>
+    </w:p>
+    <w:p>
+      <w:pPr>
+        <w:pStyle w:val="HTML"/>
+        <w:rPr>
+          <w:rStyle w:val="HTML1"/>
+        </w:rPr>
+      </w:pPr>
+      <w:r>
+        <w:rPr>
+          <w:rStyle w:val="hljs-keyword"/>
+        </w:rPr>
+        <w:t>if</w:t>
+      </w:r>
+      <w:r>
+        <w:rPr>
+          <w:rStyle w:val="HTML1"/>
+        </w:rPr>
+        <w:t xml:space="preserve"> (HAL_ADC_PollForConversion(&amp;hadc1, </w:t>
+      </w:r>
+      <w:r>
+        <w:rPr>
+          <w:rStyle w:val="hljs-number"/>
+        </w:rPr>
+        <w:t>10</w:t>
+      </w:r>
+      <w:r>
+        <w:rPr>
+          <w:rStyle w:val="HTML1"/>
+        </w:rPr>
+        <w:t>) == HAL_OK)</w:t>
+      </w:r>
+    </w:p>
+    <w:p>
+      <w:pPr>
+        <w:pStyle w:val="HTML"/>
+        <w:rPr>
+          <w:rStyle w:val="HTML1"/>
+        </w:rPr>
+      </w:pPr>
+      <w:r>
+        <w:rPr>
+          <w:rStyle w:val="HTML1"/>
+        </w:rPr>
+        <w:t>{</w:t>
+      </w:r>
+    </w:p>
+    <w:p>
+      <w:pPr>
+        <w:pStyle w:val="HTML"/>
+        <w:rPr>
+          <w:rStyle w:val="HTML1"/>
+        </w:rPr>
+      </w:pPr>
+      <w:r>
+        <w:rPr>
+          <w:rStyle w:val="HTML1"/>
+        </w:rPr>
+        <w:t xml:space="preserve">    </w:t>
+      </w:r>
+      <w:r>
+        <w:rPr>
+          <w:rStyle w:val="hljs-comment"/>
+        </w:rPr>
+        <w:t>// 3. 转换成功，读取最新的 ADC 数值</w:t>
+      </w:r>
+    </w:p>
+    <w:p>
+      <w:pPr>
+        <w:pStyle w:val="HTML"/>
+        <w:rPr>
+          <w:rStyle w:val="HTML1"/>
+        </w:rPr>
+      </w:pPr>
+      <w:r>
+        <w:rPr>
+          <w:rStyle w:val="HTML1"/>
+        </w:rPr>
+        <w:t xml:space="preserve">    adc_value = HAL_ADC_GetValue(&amp;hadc1);</w:t>
+      </w:r>
+    </w:p>
+    <w:p>
+      <w:pPr>
+        <w:pStyle w:val="HTML"/>
+        <w:rPr>
+          <w:rStyle w:val="HTML1"/>
+        </w:rPr>
+      </w:pPr>
+      <w:r>
+        <w:rPr>
+          <w:rStyle w:val="HTML1"/>
+        </w:rPr>
+        <w:t>}</w:t>
+      </w:r>
+    </w:p>
+    <w:p>
+      <w:pPr>
+        <w:pStyle w:val="HTML"/>
+        <w:rPr>
+          <w:rStyle w:val="HTML1"/>
+        </w:rPr>
+      </w:pPr>
+      <w:r>
+        <w:rPr>
+          <w:rStyle w:val="hljs-keyword"/>
+        </w:rPr>
+        <w:t>else</w:t>
+      </w:r>
+    </w:p>
+    <w:p>
+      <w:pPr>
+        <w:pStyle w:val="HTML"/>
+        <w:rPr>
+          <w:rStyle w:val="HTML1"/>
+        </w:rPr>
+      </w:pPr>
+      <w:r>
+        <w:rPr>
+          <w:rStyle w:val="HTML1"/>
+        </w:rPr>
+        <w:t>{</w:t>
+      </w:r>
+    </w:p>
+    <w:p>
+      <w:pPr>
+        <w:pStyle w:val="HTML"/>
+        <w:rPr>
+          <w:rStyle w:val="HTML1"/>
+        </w:rPr>
+      </w:pPr>
+      <w:r>
+        <w:rPr>
+          <w:rStyle w:val="HTML1"/>
+        </w:rPr>
+        <w:t xml:space="preserve">    </w:t>
+      </w:r>
+      <w:r>
+        <w:rPr>
+          <w:rStyle w:val="hljs-comment"/>
+        </w:rPr>
+        <w:t>// 超时或出错处理</w:t>
+      </w:r>
+    </w:p>
+    <w:p>
+      <w:pPr>
+        <w:pStyle w:val="HTML"/>
+        <w:rPr>
+          <w:rStyle w:val="HTML1"/>
+        </w:rPr>
+      </w:pPr>
+      <w:r>
+        <w:rPr>
+          <w:rStyle w:val="HTML1"/>
+        </w:rPr>
+        <w:t xml:space="preserve">    </w:t>
+      </w:r>
+      <w:r>
+        <w:rPr>
+          <w:rStyle w:val="hljs-comment"/>
+        </w:rPr>
+        <w:t>// printf("ADC Conversion Timeout/Error!\n");</w:t>
+      </w:r>
+    </w:p>
+    <w:p>
+      <w:pPr>
+        <w:pStyle w:val="HTML"/>
+      </w:pPr>
+      <w:r>
+        <w:rPr>
+          <w:rStyle w:val="HTML1"/>
+        </w:rPr>
+        <w:t>}</w:t>
+      </w:r>
+    </w:p>
+    <w:p>
+      <w:pPr>
+        <w:pStyle w:val="1"/>
+      </w:pPr>
+      <w:r>
+        <w:rPr>
+          <w:rStyle w:val="ng-star-inserted1"/>
+        </w:rPr>
+        <w:t>HAL_ADC_GetValue()</w:t>
+      </w:r>
+    </w:p>
+    <w:p>
+      <w:pPr>
+        <w:pStyle w:val="ng-star-inserted"/>
+      </w:pPr>
+      <w:r>
+        <w:rPr>
+          <w:rStyle w:val="inline-code"/>
+        </w:rPr>
+        <w:t>HAL_ADC_GetValue()</w:t>
+      </w:r>
+      <w:r>
+        <w:rPr>
+          <w:rStyle w:val="ng-star-inserted1"/>
+        </w:rPr>
+        <w:t xml:space="preserve"> 是 STM32 HAL 库中用于</w:t>
+      </w:r>
+      <w:r>
+        <w:rPr>
+          <w:rStyle w:val="ng-star-inserted1"/>
+          <w:b/>
+          <w:bCs/>
+        </w:rPr>
+        <w:t>读取 ADC 转换结果</w:t>
+      </w:r>
+      <w:r>
+        <w:rPr>
+          <w:rStyle w:val="ng-star-inserted1"/>
+        </w:rPr>
+        <w:t>的函数。它直接从 ADC 的数据寄存器（DR）中提取最终的数字量。</w:t>
+      </w:r>
+    </w:p>
+    <w:p>
+      <w:pPr>
+        <w:pStyle w:val="2"/>
+      </w:pPr>
+      <w:r>
+        <w:rPr>
+          <w:rStyle w:val="ng-star-inserted1"/>
+        </w:rPr>
+        <w:t>函数原型</w:t>
+      </w:r>
+    </w:p>
+    <w:p>
+      <w:pPr>
+        <w:rPr>
+          <w:rStyle w:val="mat-content"/>
+        </w:rPr>
+      </w:pPr>
+      <w:r>
+        <w:rPr>
+          <w:rStyle w:val="material-symbols-outlined"/>
+        </w:rPr>
+        <w:t xml:space="preserve">code </w:t>
+      </w:r>
+      <w:r>
+        <w:rPr>
+          <w:rStyle w:val="ng-star-inserted1"/>
+        </w:rPr>
+        <w:t>C</w:t>
+      </w:r>
+    </w:p>
+    <w:p>
+      <w:r>
+        <w:rPr>
+          <w:rStyle w:val="material-symbols-outlined"/>
+        </w:rPr>
+        <w:t>downloadcontent_copy</w:t>
+      </w:r>
+    </w:p>
+    <w:p>
+      <w:r>
+        <w:rPr>
+          <w:rStyle w:val="material-symbols-outlined"/>
+        </w:rPr>
+        <w:t>expand_less</w:t>
+      </w:r>
+    </w:p>
+    <w:p>
+      <w:pPr>
+        <w:pStyle w:val="HTML"/>
+      </w:pPr>
+      <w:r>
+        <w:rPr>
+          <w:rStyle w:val="hljs-keyword"/>
+        </w:rPr>
+        <w:t>uint32_t</w:t>
+      </w:r>
+      <w:r>
+        <w:rPr>
+          <w:rStyle w:val="hljs-function"/>
+        </w:rPr>
+        <w:t xml:space="preserve"> </w:t>
+      </w:r>
+      <w:r>
+        <w:rPr>
+          <w:rStyle w:val="hljs-title"/>
+        </w:rPr>
+        <w:t>HAL_ADC_GetValue</w:t>
+      </w:r>
+      <w:r>
+        <w:rPr>
+          <w:rStyle w:val="hljs-params"/>
+        </w:rPr>
+        <w:t>(ADC_HandleTypeDef *hadc)</w:t>
+      </w:r>
+      <w:r>
+        <w:rPr>
+          <w:rStyle w:val="HTML1"/>
+        </w:rPr>
+        <w:t>;</w:t>
+      </w:r>
+    </w:p>
+    <w:p>
+      <w:pPr>
+        <w:pStyle w:val="2"/>
+      </w:pPr>
+      <w:r>
+        <w:rPr>
+          <w:rStyle w:val="ng-star-inserted1"/>
+        </w:rPr>
+        <w:t>参数</w:t>
+      </w:r>
+    </w:p>
+    <w:p>
+      <w:pPr>
+        <w:pStyle w:val="ng-star-inserted"/>
+        <w:numPr>
+          <w:ilvl w:val="0"/>
+          <w:numId w:val="13"/>
+        </w:numPr>
+      </w:pPr>
+      <w:r>
+        <w:rPr>
+          <w:rStyle w:val="inline-code"/>
+          <w:b/>
+          <w:bCs/>
+        </w:rPr>
+        <w:t>hadc</w:t>
+      </w:r>
+      <w:r>
+        <w:rPr>
+          <w:rStyle w:val="ng-star-inserted1"/>
+        </w:rPr>
+        <w:t>: ADC 句柄指针（例如：</w:t>
+      </w:r>
+      <w:r>
+        <w:rPr>
+          <w:rStyle w:val="inline-code"/>
+        </w:rPr>
+        <w:t>&amp;hadc1</w:t>
+      </w:r>
+      <w:r>
+        <w:rPr>
+          <w:rStyle w:val="ng-star-inserted1"/>
+        </w:rPr>
+        <w:t>），代表你要读取数据的那个 ADC 外设。</w:t>
+      </w:r>
+    </w:p>
+    <w:p>
+      <w:pPr>
+        <w:pStyle w:val="2"/>
+      </w:pPr>
+      <w:r>
+        <w:rPr>
+          <w:rStyle w:val="ng-star-inserted1"/>
+        </w:rPr>
+        <w:t>返回值</w:t>
+      </w:r>
+    </w:p>
+    <w:p>
+      <w:pPr>
+        <w:pStyle w:val="ng-star-inserted"/>
+        <w:numPr>
+          <w:ilvl w:val="0"/>
+          <w:numId w:val="14"/>
+        </w:numPr>
+      </w:pPr>
+      <w:r>
+        <w:rPr>
+          <w:rStyle w:val="ng-star-inserted1"/>
+          <w:b/>
+          <w:bCs/>
+        </w:rPr>
+        <w:t>返回值类型</w:t>
+      </w:r>
+      <w:r>
+        <w:rPr>
+          <w:rStyle w:val="ng-star-inserted1"/>
+        </w:rPr>
+        <w:t xml:space="preserve">: </w:t>
+      </w:r>
+      <w:r>
+        <w:rPr>
+          <w:rStyle w:val="inline-code"/>
+        </w:rPr>
+        <w:t>uint32_t</w:t>
+      </w:r>
+      <w:r>
+        <w:rPr>
+          <w:rStyle w:val="ng-star-inserted1"/>
+        </w:rPr>
+        <w:t>。</w:t>
+      </w:r>
+    </w:p>
+    <w:p>
+      <w:pPr>
+        <w:pStyle w:val="ng-star-inserted"/>
+        <w:numPr>
+          <w:ilvl w:val="0"/>
+          <w:numId w:val="14"/>
+        </w:numPr>
+      </w:pPr>
+      <w:r>
+        <w:rPr>
+          <w:rStyle w:val="ng-star-inserted1"/>
+          <w:b/>
+          <w:bCs/>
+        </w:rPr>
+        <w:t>返回值含义</w:t>
+      </w:r>
+      <w:r>
+        <w:rPr>
+          <w:rStyle w:val="ng-star-inserted1"/>
+        </w:rPr>
+        <w:t>: 返回最近一次 ADC 转换完成的数字量结果。</w:t>
+      </w:r>
+      <w:r>
+        <w:br/>
+      </w:r>
+      <w:r>
+        <w:rPr>
+          <w:rStyle w:val="ng-star-inserted1"/>
+          <w:i/>
+          <w:iCs/>
+        </w:rPr>
+        <w:t>(注：虽然返回类型是 32 位，但实际有效位数取决于 ADC 的分辨率设置，通常是 12 位，即范围为 0 ~ 4095)。</w:t>
+      </w:r>
+    </w:p>
+    <w:p>
+      <w:pPr>
+        <w:pStyle w:val="2"/>
+      </w:pPr>
       <w:bookmarkStart w:id="0" w:name="_GoBack"/>
       <w:bookmarkEnd w:id="0"/>
-    </w:p>
-    <w:p>
-      <w:pPr>
-        <w:pStyle w:val="HTML"/>
-        <w:rPr>
-          <w:rStyle w:val="HTML1"/>
-        </w:rPr>
-      </w:pPr>
+      <w:r>
+        <w:rPr>
+          <w:rStyle w:val="ng-star-inserted1"/>
+        </w:rPr>
+        <w:lastRenderedPageBreak/>
+        <w:t>基本用法</w:t>
+      </w:r>
+    </w:p>
+    <w:p>
+      <w:pPr>
+        <w:pStyle w:val="ng-star-inserted"/>
+      </w:pPr>
+      <w:r>
+        <w:rPr>
+          <w:rStyle w:val="ng-star-inserted1"/>
+        </w:rPr>
+        <w:t xml:space="preserve">必须在确保 ADC 转换已经完成的情况下调用。最常用的场景有两种：一是配合 </w:t>
+      </w:r>
+      <w:r>
+        <w:rPr>
+          <w:rStyle w:val="inline-code"/>
+        </w:rPr>
+        <w:t>HAL_ADC_PollForConversion()</w:t>
+      </w:r>
+      <w:r>
+        <w:rPr>
+          <w:rStyle w:val="ng-star-inserted1"/>
+        </w:rPr>
+        <w:t xml:space="preserve"> 在</w:t>
+      </w:r>
+      <w:r>
+        <w:rPr>
+          <w:rStyle w:val="ng-star-inserted1"/>
+          <w:b/>
+          <w:bCs/>
+        </w:rPr>
+        <w:t>轮询模式</w:t>
+      </w:r>
+      <w:r>
+        <w:rPr>
+          <w:rStyle w:val="ng-star-inserted1"/>
+        </w:rPr>
+        <w:t xml:space="preserve">下读取；二是在 </w:t>
+      </w:r>
+      <w:r>
+        <w:rPr>
+          <w:rStyle w:val="ng-star-inserted1"/>
+          <w:b/>
+          <w:bCs/>
+        </w:rPr>
+        <w:t>ADC 转换完成回调函数</w:t>
+      </w:r>
+      <w:r>
+        <w:rPr>
+          <w:rStyle w:val="ng-star-inserted1"/>
+        </w:rPr>
+        <w:t>（中断模式/DMA模式）中读取。</w:t>
+      </w:r>
+    </w:p>
+    <w:p>
+      <w:pPr>
+        <w:pStyle w:val="ng-star-inserted"/>
+      </w:pPr>
+      <w:r>
+        <w:rPr>
+          <w:rStyle w:val="ng-star-inserted1"/>
+          <w:b/>
+          <w:bCs/>
+        </w:rPr>
+        <w:t>示例代码 1：轮询模式</w:t>
+      </w:r>
+    </w:p>
+    <w:p>
+      <w:pPr>
+        <w:rPr>
+          <w:rStyle w:val="mat-content"/>
+        </w:rPr>
+      </w:pPr>
+      <w:r>
+        <w:rPr>
+          <w:rStyle w:val="material-symbols-outlined"/>
+        </w:rPr>
+        <w:t xml:space="preserve">code </w:t>
+      </w:r>
+      <w:r>
+        <w:rPr>
+          <w:rStyle w:val="ng-star-inserted1"/>
+        </w:rPr>
+        <w:t>C</w:t>
+      </w:r>
+    </w:p>
+    <w:p>
+      <w:r>
+        <w:rPr>
+          <w:rStyle w:val="material-symbols-outlined"/>
+        </w:rPr>
+        <w:t>downloadcontent_copy</w:t>
+      </w:r>
+    </w:p>
+    <w:p>
+      <w:r>
+        <w:rPr>
+          <w:rStyle w:val="material-symbols-outlined"/>
+        </w:rPr>
+        <w:t>expand_less</w:t>
+      </w:r>
+    </w:p>
+    <w:p>
+      <w:pPr>
+        <w:pStyle w:val="HTML"/>
+        <w:rPr>
+          <w:rStyle w:val="HTML1"/>
+        </w:rPr>
+      </w:pPr>
+      <w:r>
+        <w:rPr>
+          <w:rStyle w:val="hljs-keyword"/>
+        </w:rPr>
+        <w:t>uint32_t</w:t>
+      </w:r>
+      <w:r>
+        <w:rPr>
+          <w:rStyle w:val="HTML1"/>
+        </w:rPr>
+        <w:t xml:space="preserve"> adc_val = </w:t>
+      </w:r>
+      <w:r>
+        <w:rPr>
+          <w:rStyle w:val="hljs-number"/>
+        </w:rPr>
+        <w:t>0</w:t>
+      </w:r>
+      <w:r>
+        <w:rPr>
+          <w:rStyle w:val="HTML1"/>
+        </w:rPr>
+        <w:t>;</w:t>
+      </w:r>
+    </w:p>
+    <w:p>
+      <w:pPr>
+        <w:pStyle w:val="HTML"/>
+        <w:rPr>
+          <w:rStyle w:val="HTML1"/>
+        </w:rPr>
+      </w:pPr>
+    </w:p>
+    <w:p>
+      <w:pPr>
+        <w:pStyle w:val="HTML"/>
+        <w:rPr>
+          <w:rStyle w:val="HTML1"/>
+        </w:rPr>
+      </w:pPr>
+      <w:r>
+        <w:rPr>
+          <w:rStyle w:val="HTML1"/>
+        </w:rPr>
+        <w:t xml:space="preserve">HAL_ADC_Start(&amp;hadc1);                           </w:t>
+      </w:r>
       <w:r>
         <w:rPr>
           <w:rStyle w:val="hljs-comment"/>
         </w:rPr>
-        <w:t>// 示例 2：将定时器3的计数值设置为 1000</w:t>
-      </w:r>
-    </w:p>
-    <w:p>
-      <w:pPr>
-        <w:pStyle w:val="HTML"/>
-        <w:rPr>
-          <w:rStyle w:val="HTML1"/>
-        </w:rPr>
-      </w:pPr>
-      <w:r>
-        <w:rPr>
-          <w:rStyle w:val="HTML1"/>
-        </w:rPr>
-        <w:t xml:space="preserve">__HAL_TIM_SET_COUNTER(&amp;htim3, </w:t>
+        <w:t>// 启动转换</w:t>
+      </w:r>
+    </w:p>
+    <w:p>
+      <w:pPr>
+        <w:pStyle w:val="HTML"/>
+        <w:rPr>
+          <w:rStyle w:val="HTML1"/>
+        </w:rPr>
+      </w:pPr>
+      <w:r>
+        <w:rPr>
+          <w:rStyle w:val="hljs-keyword"/>
+        </w:rPr>
+        <w:t>if</w:t>
+      </w:r>
+      <w:r>
+        <w:rPr>
+          <w:rStyle w:val="HTML1"/>
+        </w:rPr>
+        <w:t xml:space="preserve"> (HAL_ADC_PollForConversion(&amp;hadc1, </w:t>
       </w:r>
       <w:r>
         <w:rPr>
           <w:rStyle w:val="hljs-number"/>
         </w:rPr>
-        <w:t>1000</w:t>
-      </w:r>
-      <w:r>
-        <w:rPr>
-          <w:rStyle w:val="HTML1"/>
-        </w:rPr>
-        <w:t>);</w:t>
-      </w:r>
-    </w:p>
-    <w:p>
-      <w:pPr>
-        <w:pStyle w:val="HTML"/>
-        <w:rPr>
-          <w:rStyle w:val="HTML1"/>
-        </w:rPr>
-      </w:pPr>
-    </w:p>
-    <w:p>
-      <w:pPr>
-        <w:pStyle w:val="HTML"/>
-        <w:rPr>
-          <w:rStyle w:val="HTML1"/>
-        </w:rPr>
-      </w:pPr>
+        <w:t>10</w:t>
+      </w:r>
+      <w:r>
+        <w:rPr>
+          <w:rStyle w:val="HTML1"/>
+        </w:rPr>
+        <w:t xml:space="preserve">) == HAL_OK) </w:t>
+      </w:r>
       <w:r>
         <w:rPr>
           <w:rStyle w:val="hljs-comment"/>
         </w:rPr>
-        <w:t>// 综合应用：定时读取编码器增量并清零</w:t>
-      </w:r>
-    </w:p>
-    <w:p>
-      <w:pPr>
-        <w:pStyle w:val="HTML"/>
-        <w:rPr>
-          <w:rStyle w:val="HTML1"/>
-        </w:rPr>
-      </w:pPr>
+        <w:t>// 等待转换完成</w:t>
+      </w:r>
+    </w:p>
+    <w:p>
+      <w:pPr>
+        <w:pStyle w:val="HTML"/>
+        <w:rPr>
+          <w:rStyle w:val="HTML1"/>
+        </w:rPr>
+      </w:pPr>
+      <w:r>
+        <w:rPr>
+          <w:rStyle w:val="HTML1"/>
+        </w:rPr>
+        <w:t>{</w:t>
+      </w:r>
+    </w:p>
+    <w:p>
+      <w:pPr>
+        <w:pStyle w:val="HTML"/>
+        <w:rPr>
+          <w:rStyle w:val="HTML1"/>
+        </w:rPr>
+      </w:pPr>
+      <w:r>
+        <w:rPr>
+          <w:rStyle w:val="HTML1"/>
+        </w:rPr>
+        <w:t xml:space="preserve">    adc_val = HAL_ADC_GetValue(&amp;hadc1);          </w:t>
+      </w:r>
+      <w:r>
+        <w:rPr>
+          <w:rStyle w:val="hljs-comment"/>
+        </w:rPr>
+        <w:t>// 读取数值</w:t>
+      </w:r>
+    </w:p>
+    <w:p>
+      <w:pPr>
+        <w:pStyle w:val="HTML"/>
+      </w:pPr>
+      <w:r>
+        <w:rPr>
+          <w:rStyle w:val="HTML1"/>
+        </w:rPr>
+        <w:t>}</w:t>
+      </w:r>
+    </w:p>
+    <w:p>
+      <w:pPr>
+        <w:pStyle w:val="ng-star-inserted"/>
+      </w:pPr>
+      <w:r>
+        <w:rPr>
+          <w:rStyle w:val="ng-star-inserted1"/>
+          <w:b/>
+          <w:bCs/>
+        </w:rPr>
+        <w:t>示例代码 2：中断模式 (在回调函数中读取)</w:t>
+      </w:r>
+    </w:p>
+    <w:p>
+      <w:pPr>
+        <w:rPr>
+          <w:rStyle w:val="mat-content"/>
+        </w:rPr>
+      </w:pPr>
+      <w:r>
+        <w:rPr>
+          <w:rStyle w:val="material-symbols-outlined"/>
+        </w:rPr>
+        <w:t xml:space="preserve">code </w:t>
+      </w:r>
+      <w:r>
+        <w:rPr>
+          <w:rStyle w:val="ng-star-inserted1"/>
+        </w:rPr>
+        <w:t>C</w:t>
+      </w:r>
+    </w:p>
+    <w:p>
+      <w:r>
+        <w:rPr>
+          <w:rStyle w:val="material-symbols-outlined"/>
+        </w:rPr>
+        <w:t>downloadcontent_copy</w:t>
+      </w:r>
+    </w:p>
+    <w:p>
+      <w:r>
+        <w:rPr>
+          <w:rStyle w:val="material-symbols-outlined"/>
+        </w:rPr>
+        <w:t>expand_less</w:t>
+      </w:r>
+    </w:p>
+    <w:p>
+      <w:pPr>
+        <w:pStyle w:val="HTML"/>
+        <w:rPr>
+          <w:rStyle w:val="HTML1"/>
+        </w:rPr>
+      </w:pPr>
+      <w:r>
+        <w:rPr>
+          <w:rStyle w:val="hljs-comment"/>
+        </w:rPr>
+        <w:t>// 主程序中调用 HAL_ADC_Start_IT(&amp;hadc1); 启动中断转换</w:t>
+      </w:r>
+    </w:p>
+    <w:p>
+      <w:pPr>
+        <w:pStyle w:val="HTML"/>
+        <w:rPr>
+          <w:rStyle w:val="HTML1"/>
+        </w:rPr>
+      </w:pPr>
+    </w:p>
+    <w:p>
+      <w:pPr>
+        <w:pStyle w:val="HTML"/>
+        <w:rPr>
+          <w:rStyle w:val="HTML1"/>
+        </w:rPr>
+      </w:pPr>
+      <w:r>
+        <w:rPr>
+          <w:rStyle w:val="hljs-comment"/>
+        </w:rPr>
+        <w:t>// 自动触发的转换完成回调函数</w:t>
+      </w:r>
+    </w:p>
+    <w:p>
+      <w:pPr>
+        <w:pStyle w:val="HTML"/>
+        <w:rPr>
+          <w:rStyle w:val="HTML1"/>
+        </w:rPr>
+      </w:pPr>
+      <w:r>
+        <w:rPr>
+          <w:rStyle w:val="hljs-builtin"/>
+        </w:rPr>
+        <w:t>void</w:t>
+      </w:r>
+      <w:r>
+        <w:rPr>
+          <w:rStyle w:val="HTML1"/>
+        </w:rPr>
+        <w:t xml:space="preserve"> </w:t>
+      </w:r>
+      <w:r>
+        <w:rPr>
+          <w:rStyle w:val="hljs-title"/>
+        </w:rPr>
+        <w:t>HAL_ADC_ConvCpltCallback</w:t>
+      </w:r>
+      <w:r>
+        <w:rPr>
+          <w:rStyle w:val="hljs-function"/>
+        </w:rPr>
+        <w:t>(</w:t>
+      </w:r>
+      <w:r>
+        <w:rPr>
+          <w:rStyle w:val="hljs-params"/>
+        </w:rPr>
+        <w:t>ADC_HandleTypeDef* hadc</w:t>
+      </w:r>
+      <w:r>
+        <w:rPr>
+          <w:rStyle w:val="hljs-function"/>
+        </w:rPr>
+        <w:t>)</w:t>
+      </w:r>
+    </w:p>
+    <w:p>
+      <w:pPr>
+        <w:pStyle w:val="HTML"/>
+        <w:rPr>
+          <w:rStyle w:val="HTML1"/>
+        </w:rPr>
+      </w:pPr>
+      <w:r>
+        <w:rPr>
+          <w:rStyle w:val="HTML1"/>
+        </w:rPr>
+        <w:t>{</w:t>
+      </w:r>
+    </w:p>
+    <w:p>
+      <w:pPr>
+        <w:pStyle w:val="HTML"/>
+        <w:rPr>
+          <w:rStyle w:val="HTML1"/>
+        </w:rPr>
+      </w:pPr>
+      <w:r>
+        <w:rPr>
+          <w:rStyle w:val="HTML1"/>
+        </w:rPr>
+        <w:t xml:space="preserve">    </w:t>
+      </w:r>
       <w:r>
         <w:rPr>
           <w:rStyle w:val="hljs-keyword"/>
         </w:rPr>
-        <w:t>uint32_t</w:t>
-      </w:r>
-      <w:r>
-        <w:rPr>
-          <w:rStyle w:val="HTML1"/>
-        </w:rPr>
-        <w:t xml:space="preserve"> step = __HAL_TIM_GET_COUNTER(&amp;htim2); </w:t>
+        <w:t>if</w:t>
+      </w:r>
+      <w:r>
+        <w:rPr>
+          <w:rStyle w:val="HTML1"/>
+        </w:rPr>
+        <w:t>(hadc-&gt;Instance == ADC1)</w:t>
+      </w:r>
+    </w:p>
+    <w:p>
+      <w:pPr>
+        <w:pStyle w:val="HTML"/>
+        <w:rPr>
+          <w:rStyle w:val="HTML1"/>
+        </w:rPr>
+      </w:pPr>
+      <w:r>
+        <w:rPr>
+          <w:rStyle w:val="HTML1"/>
+        </w:rPr>
+        <w:t xml:space="preserve">    {</w:t>
+      </w:r>
+    </w:p>
+    <w:p>
+      <w:pPr>
+        <w:pStyle w:val="HTML"/>
+        <w:rPr>
+          <w:rStyle w:val="HTML1"/>
+        </w:rPr>
+      </w:pPr>
+      <w:r>
+        <w:rPr>
+          <w:rStyle w:val="HTML1"/>
+        </w:rPr>
+        <w:t xml:space="preserve">        </w:t>
       </w:r>
       <w:r>
         <w:rPr>
           <w:rStyle w:val="hljs-comment"/>
         </w:rPr>
-        <w:t>// 获取过去一段时间的脉冲数</w:t>
-      </w:r>
-    </w:p>
-    <w:p>
-      <w:pPr>
-        <w:pStyle w:val="HTML"/>
-      </w:pPr>
-      <w:r>
-        <w:rPr>
-          <w:rStyle w:val="HTML1"/>
-        </w:rPr>
-        <w:lastRenderedPageBreak/>
-        <w:t xml:space="preserve">__HAL_TIM_SET_COUNTER(&amp;htim2, </w:t>
-      </w:r>
-      <w:r>
-        <w:rPr>
-          <w:rStyle w:val="hljs-number"/>
-        </w:rPr>
-        <w:t>0</w:t>
-      </w:r>
-      <w:r>
-        <w:rPr>
-          <w:rStyle w:val="HTML1"/>
-        </w:rPr>
-        <w:t xml:space="preserve">);              </w:t>
-      </w:r>
-      <w:r>
-        <w:rPr>
-          <w:rStyle w:val="hljs-comment"/>
-        </w:rPr>
-        <w:t>// 获取后立即清零，以便重新开始下一轮计数</w:t>
+        <w:t>// 转换完成，直接获取数值</w:t>
+      </w:r>
+    </w:p>
+    <w:p>
+      <w:pPr>
+        <w:pStyle w:val="HTML"/>
+        <w:rPr>
+          <w:rStyle w:val="HTML1"/>
+        </w:rPr>
+      </w:pPr>
+      <w:r>
+        <w:rPr>
+          <w:rStyle w:val="HTML1"/>
+        </w:rPr>
+        <w:t xml:space="preserve">        uint32_t adc_val = HAL_ADC_GetValue(hadc);</w:t>
+      </w:r>
+    </w:p>
+    <w:p>
+      <w:pPr>
+        <w:pStyle w:val="HTML"/>
+        <w:rPr>
+          <w:rStyle w:val="HTML1"/>
+        </w:rPr>
+      </w:pPr>
+      <w:r>
+        <w:rPr>
+          <w:rStyle w:val="HTML1"/>
+        </w:rPr>
+        <w:t xml:space="preserve">    }</w:t>
+      </w:r>
+    </w:p>
+    <w:p>
+      <w:pPr>
+        <w:pStyle w:val="HTML"/>
+      </w:pPr>
+      <w:r>
+        <w:rPr>
+          <w:rStyle w:val="HTML1"/>
+        </w:rPr>
+        <w:t>}</w:t>
       </w:r>
     </w:p>
     <w:p>
@@ -1970,6 +4749,304 @@
 <file path=word/numbering.xml><?xml version="1.0" encoding="utf-8"?>
 <w:numbering xmlns:wpc="http://schemas.microsoft.com/office/word/2010/wordprocessingCanvas" xmlns:cx="http://schemas.microsoft.com/office/drawing/2014/chartex" xmlns:mc="http://schemas.openxmlformats.org/markup-compatibility/2006" xmlns:o="urn:schemas-microsoft-com:office:office" xmlns:r="http://schemas.openxmlformats.org/officeDocument/2006/relationships" xmlns:m="http://schemas.openxmlformats.org/officeDocument/2006/math" xmlns:v="urn:schemas-microsoft-com:vml" xmlns:wp14="http://schemas.microsoft.com/office/word/2010/wordprocessingDrawing" xmlns:wp="http://schemas.openxmlformats.org/drawingml/2006/wordprocessingDrawing" xmlns:w10="urn:schemas-microsoft-com:office:word" xmlns:w="http://schemas.openxmlformats.org/wordprocessingml/2006/main" xmlns:w14="http://schemas.microsoft.com/office/word/2010/wordml" xmlns:w15="http://schemas.microsoft.com/office/word/2012/wordml" xmlns:w16se="http://schemas.microsoft.com/office/word/2015/wordml/symex" xmlns:wpg="http://schemas.microsoft.com/office/word/2010/wordprocessingGroup" xmlns:wpi="http://schemas.microsoft.com/office/word/2010/wordprocessingInk" xmlns:wne="http://schemas.microsoft.com/office/word/2006/wordml" xmlns:wps="http://schemas.microsoft.com/office/word/2010/wordprocessingShape" mc:Ignorable="w14 w15 w16se wp14">
   <w:abstractNum w:abstractNumId="0" w15:restartNumberingAfterBreak="0">
+    <w:nsid w:val="0D6473B4"/>
+    <w:multiLevelType w:val="multilevel"/>
+    <w:tmpl w:val="3F8076B2"/>
+    <w:lvl w:ilvl="0">
+      <w:start w:val="1"/>
+      <w:numFmt w:val="bullet"/>
+      <w:lvlText w:val=""/>
+      <w:lvlJc w:val="left"/>
+      <w:pPr>
+        <w:tabs>
+          <w:tab w:val="num" w:pos="720"/>
+        </w:tabs>
+        <w:ind w:left="720" w:hanging="360"/>
+      </w:pPr>
+      <w:rPr>
+        <w:rFonts w:ascii="Symbol" w:hAnsi="Symbol" w:hint="default"/>
+        <w:sz w:val="20"/>
+      </w:rPr>
+    </w:lvl>
+    <w:lvl w:ilvl="1" w:tentative="1">
+      <w:start w:val="1"/>
+      <w:numFmt w:val="bullet"/>
+      <w:lvlText w:val="o"/>
+      <w:lvlJc w:val="left"/>
+      <w:pPr>
+        <w:tabs>
+          <w:tab w:val="num" w:pos="1440"/>
+        </w:tabs>
+        <w:ind w:left="1440" w:hanging="360"/>
+      </w:pPr>
+      <w:rPr>
+        <w:rFonts w:ascii="Courier New" w:hAnsi="Courier New" w:hint="default"/>
+        <w:sz w:val="20"/>
+      </w:rPr>
+    </w:lvl>
+    <w:lvl w:ilvl="2" w:tentative="1">
+      <w:start w:val="1"/>
+      <w:numFmt w:val="bullet"/>
+      <w:lvlText w:val=""/>
+      <w:lvlJc w:val="left"/>
+      <w:pPr>
+        <w:tabs>
+          <w:tab w:val="num" w:pos="2160"/>
+        </w:tabs>
+        <w:ind w:left="2160" w:hanging="360"/>
+      </w:pPr>
+      <w:rPr>
+        <w:rFonts w:ascii="Wingdings" w:hAnsi="Wingdings" w:hint="default"/>
+        <w:sz w:val="20"/>
+      </w:rPr>
+    </w:lvl>
+    <w:lvl w:ilvl="3" w:tentative="1">
+      <w:start w:val="1"/>
+      <w:numFmt w:val="bullet"/>
+      <w:lvlText w:val=""/>
+      <w:lvlJc w:val="left"/>
+      <w:pPr>
+        <w:tabs>
+          <w:tab w:val="num" w:pos="2880"/>
+        </w:tabs>
+        <w:ind w:left="2880" w:hanging="360"/>
+      </w:pPr>
+      <w:rPr>
+        <w:rFonts w:ascii="Wingdings" w:hAnsi="Wingdings" w:hint="default"/>
+        <w:sz w:val="20"/>
+      </w:rPr>
+    </w:lvl>
+    <w:lvl w:ilvl="4" w:tentative="1">
+      <w:start w:val="1"/>
+      <w:numFmt w:val="bullet"/>
+      <w:lvlText w:val=""/>
+      <w:lvlJc w:val="left"/>
+      <w:pPr>
+        <w:tabs>
+          <w:tab w:val="num" w:pos="3600"/>
+        </w:tabs>
+        <w:ind w:left="3600" w:hanging="360"/>
+      </w:pPr>
+      <w:rPr>
+        <w:rFonts w:ascii="Wingdings" w:hAnsi="Wingdings" w:hint="default"/>
+        <w:sz w:val="20"/>
+      </w:rPr>
+    </w:lvl>
+    <w:lvl w:ilvl="5" w:tentative="1">
+      <w:start w:val="1"/>
+      <w:numFmt w:val="bullet"/>
+      <w:lvlText w:val=""/>
+      <w:lvlJc w:val="left"/>
+      <w:pPr>
+        <w:tabs>
+          <w:tab w:val="num" w:pos="4320"/>
+        </w:tabs>
+        <w:ind w:left="4320" w:hanging="360"/>
+      </w:pPr>
+      <w:rPr>
+        <w:rFonts w:ascii="Wingdings" w:hAnsi="Wingdings" w:hint="default"/>
+        <w:sz w:val="20"/>
+      </w:rPr>
+    </w:lvl>
+    <w:lvl w:ilvl="6" w:tentative="1">
+      <w:start w:val="1"/>
+      <w:numFmt w:val="bullet"/>
+      <w:lvlText w:val=""/>
+      <w:lvlJc w:val="left"/>
+      <w:pPr>
+        <w:tabs>
+          <w:tab w:val="num" w:pos="5040"/>
+        </w:tabs>
+        <w:ind w:left="5040" w:hanging="360"/>
+      </w:pPr>
+      <w:rPr>
+        <w:rFonts w:ascii="Wingdings" w:hAnsi="Wingdings" w:hint="default"/>
+        <w:sz w:val="20"/>
+      </w:rPr>
+    </w:lvl>
+    <w:lvl w:ilvl="7" w:tentative="1">
+      <w:start w:val="1"/>
+      <w:numFmt w:val="bullet"/>
+      <w:lvlText w:val=""/>
+      <w:lvlJc w:val="left"/>
+      <w:pPr>
+        <w:tabs>
+          <w:tab w:val="num" w:pos="5760"/>
+        </w:tabs>
+        <w:ind w:left="5760" w:hanging="360"/>
+      </w:pPr>
+      <w:rPr>
+        <w:rFonts w:ascii="Wingdings" w:hAnsi="Wingdings" w:hint="default"/>
+        <w:sz w:val="20"/>
+      </w:rPr>
+    </w:lvl>
+    <w:lvl w:ilvl="8" w:tentative="1">
+      <w:start w:val="1"/>
+      <w:numFmt w:val="bullet"/>
+      <w:lvlText w:val=""/>
+      <w:lvlJc w:val="left"/>
+      <w:pPr>
+        <w:tabs>
+          <w:tab w:val="num" w:pos="6480"/>
+        </w:tabs>
+        <w:ind w:left="6480" w:hanging="360"/>
+      </w:pPr>
+      <w:rPr>
+        <w:rFonts w:ascii="Wingdings" w:hAnsi="Wingdings" w:hint="default"/>
+        <w:sz w:val="20"/>
+      </w:rPr>
+    </w:lvl>
+  </w:abstractNum>
+  <w:abstractNum w:abstractNumId="1" w15:restartNumberingAfterBreak="0">
+    <w:nsid w:val="1D050BBE"/>
+    <w:multiLevelType w:val="multilevel"/>
+    <w:tmpl w:val="3378DD5C"/>
+    <w:lvl w:ilvl="0">
+      <w:start w:val="1"/>
+      <w:numFmt w:val="bullet"/>
+      <w:lvlText w:val=""/>
+      <w:lvlJc w:val="left"/>
+      <w:pPr>
+        <w:tabs>
+          <w:tab w:val="num" w:pos="720"/>
+        </w:tabs>
+        <w:ind w:left="720" w:hanging="360"/>
+      </w:pPr>
+      <w:rPr>
+        <w:rFonts w:ascii="Symbol" w:hAnsi="Symbol" w:hint="default"/>
+        <w:sz w:val="20"/>
+      </w:rPr>
+    </w:lvl>
+    <w:lvl w:ilvl="1" w:tentative="1">
+      <w:start w:val="1"/>
+      <w:numFmt w:val="bullet"/>
+      <w:lvlText w:val="o"/>
+      <w:lvlJc w:val="left"/>
+      <w:pPr>
+        <w:tabs>
+          <w:tab w:val="num" w:pos="1440"/>
+        </w:tabs>
+        <w:ind w:left="1440" w:hanging="360"/>
+      </w:pPr>
+      <w:rPr>
+        <w:rFonts w:ascii="Courier New" w:hAnsi="Courier New" w:hint="default"/>
+        <w:sz w:val="20"/>
+      </w:rPr>
+    </w:lvl>
+    <w:lvl w:ilvl="2" w:tentative="1">
+      <w:start w:val="1"/>
+      <w:numFmt w:val="bullet"/>
+      <w:lvlText w:val=""/>
+      <w:lvlJc w:val="left"/>
+      <w:pPr>
+        <w:tabs>
+          <w:tab w:val="num" w:pos="2160"/>
+        </w:tabs>
+        <w:ind w:left="2160" w:hanging="360"/>
+      </w:pPr>
+      <w:rPr>
+        <w:rFonts w:ascii="Wingdings" w:hAnsi="Wingdings" w:hint="default"/>
+        <w:sz w:val="20"/>
+      </w:rPr>
+    </w:lvl>
+    <w:lvl w:ilvl="3" w:tentative="1">
+      <w:start w:val="1"/>
+      <w:numFmt w:val="bullet"/>
+      <w:lvlText w:val=""/>
+      <w:lvlJc w:val="left"/>
+      <w:pPr>
+        <w:tabs>
+          <w:tab w:val="num" w:pos="2880"/>
+        </w:tabs>
+        <w:ind w:left="2880" w:hanging="360"/>
+      </w:pPr>
+      <w:rPr>
+        <w:rFonts w:ascii="Wingdings" w:hAnsi="Wingdings" w:hint="default"/>
+        <w:sz w:val="20"/>
+      </w:rPr>
+    </w:lvl>
+    <w:lvl w:ilvl="4" w:tentative="1">
+      <w:start w:val="1"/>
+      <w:numFmt w:val="bullet"/>
+      <w:lvlText w:val=""/>
+      <w:lvlJc w:val="left"/>
+      <w:pPr>
+        <w:tabs>
+          <w:tab w:val="num" w:pos="3600"/>
+        </w:tabs>
+        <w:ind w:left="3600" w:hanging="360"/>
+      </w:pPr>
+      <w:rPr>
+        <w:rFonts w:ascii="Wingdings" w:hAnsi="Wingdings" w:hint="default"/>
+        <w:sz w:val="20"/>
+      </w:rPr>
+    </w:lvl>
+    <w:lvl w:ilvl="5" w:tentative="1">
+      <w:start w:val="1"/>
+      <w:numFmt w:val="bullet"/>
+      <w:lvlText w:val=""/>
+      <w:lvlJc w:val="left"/>
+      <w:pPr>
+        <w:tabs>
+          <w:tab w:val="num" w:pos="4320"/>
+        </w:tabs>
+        <w:ind w:left="4320" w:hanging="360"/>
+      </w:pPr>
+      <w:rPr>
+        <w:rFonts w:ascii="Wingdings" w:hAnsi="Wingdings" w:hint="default"/>
+        <w:sz w:val="20"/>
+      </w:rPr>
+    </w:lvl>
+    <w:lvl w:ilvl="6" w:tentative="1">
+      <w:start w:val="1"/>
+      <w:numFmt w:val="bullet"/>
+      <w:lvlText w:val=""/>
+      <w:lvlJc w:val="left"/>
+      <w:pPr>
+        <w:tabs>
+          <w:tab w:val="num" w:pos="5040"/>
+        </w:tabs>
+        <w:ind w:left="5040" w:hanging="360"/>
+      </w:pPr>
+      <w:rPr>
+        <w:rFonts w:ascii="Wingdings" w:hAnsi="Wingdings" w:hint="default"/>
+        <w:sz w:val="20"/>
+      </w:rPr>
+    </w:lvl>
+    <w:lvl w:ilvl="7" w:tentative="1">
+      <w:start w:val="1"/>
+      <w:numFmt w:val="bullet"/>
+      <w:lvlText w:val=""/>
+      <w:lvlJc w:val="left"/>
+      <w:pPr>
+        <w:tabs>
+          <w:tab w:val="num" w:pos="5760"/>
+        </w:tabs>
+        <w:ind w:left="5760" w:hanging="360"/>
+      </w:pPr>
+      <w:rPr>
+        <w:rFonts w:ascii="Wingdings" w:hAnsi="Wingdings" w:hint="default"/>
+        <w:sz w:val="20"/>
+      </w:rPr>
+    </w:lvl>
+    <w:lvl w:ilvl="8" w:tentative="1">
+      <w:start w:val="1"/>
+      <w:numFmt w:val="bullet"/>
+      <w:lvlText w:val=""/>
+      <w:lvlJc w:val="left"/>
+      <w:pPr>
+        <w:tabs>
+          <w:tab w:val="num" w:pos="6480"/>
+        </w:tabs>
+        <w:ind w:left="6480" w:hanging="360"/>
+      </w:pPr>
+      <w:rPr>
+        <w:rFonts w:ascii="Wingdings" w:hAnsi="Wingdings" w:hint="default"/>
+        <w:sz w:val="20"/>
+      </w:rPr>
+    </w:lvl>
+  </w:abstractNum>
+  <w:abstractNum w:abstractNumId="2" w15:restartNumberingAfterBreak="0">
     <w:nsid w:val="1E8936C9"/>
     <w:multiLevelType w:val="multilevel"/>
     <w:tmpl w:val="DE5AE1D6"/>
@@ -2118,7 +5195,156 @@
       </w:rPr>
     </w:lvl>
   </w:abstractNum>
-  <w:abstractNum w:abstractNumId="1" w15:restartNumberingAfterBreak="0">
+  <w:abstractNum w:abstractNumId="3" w15:restartNumberingAfterBreak="0">
+    <w:nsid w:val="27454430"/>
+    <w:multiLevelType w:val="multilevel"/>
+    <w:tmpl w:val="71A8CA1A"/>
+    <w:lvl w:ilvl="0">
+      <w:start w:val="1"/>
+      <w:numFmt w:val="bullet"/>
+      <w:lvlText w:val=""/>
+      <w:lvlJc w:val="left"/>
+      <w:pPr>
+        <w:tabs>
+          <w:tab w:val="num" w:pos="720"/>
+        </w:tabs>
+        <w:ind w:left="720" w:hanging="360"/>
+      </w:pPr>
+      <w:rPr>
+        <w:rFonts w:ascii="Symbol" w:hAnsi="Symbol" w:hint="default"/>
+        <w:sz w:val="20"/>
+      </w:rPr>
+    </w:lvl>
+    <w:lvl w:ilvl="1" w:tentative="1">
+      <w:start w:val="1"/>
+      <w:numFmt w:val="bullet"/>
+      <w:lvlText w:val="o"/>
+      <w:lvlJc w:val="left"/>
+      <w:pPr>
+        <w:tabs>
+          <w:tab w:val="num" w:pos="1440"/>
+        </w:tabs>
+        <w:ind w:left="1440" w:hanging="360"/>
+      </w:pPr>
+      <w:rPr>
+        <w:rFonts w:ascii="Courier New" w:hAnsi="Courier New" w:hint="default"/>
+        <w:sz w:val="20"/>
+      </w:rPr>
+    </w:lvl>
+    <w:lvl w:ilvl="2" w:tentative="1">
+      <w:start w:val="1"/>
+      <w:numFmt w:val="bullet"/>
+      <w:lvlText w:val=""/>
+      <w:lvlJc w:val="left"/>
+      <w:pPr>
+        <w:tabs>
+          <w:tab w:val="num" w:pos="2160"/>
+        </w:tabs>
+        <w:ind w:left="2160" w:hanging="360"/>
+      </w:pPr>
+      <w:rPr>
+        <w:rFonts w:ascii="Wingdings" w:hAnsi="Wingdings" w:hint="default"/>
+        <w:sz w:val="20"/>
+      </w:rPr>
+    </w:lvl>
+    <w:lvl w:ilvl="3" w:tentative="1">
+      <w:start w:val="1"/>
+      <w:numFmt w:val="bullet"/>
+      <w:lvlText w:val=""/>
+      <w:lvlJc w:val="left"/>
+      <w:pPr>
+        <w:tabs>
+          <w:tab w:val="num" w:pos="2880"/>
+        </w:tabs>
+        <w:ind w:left="2880" w:hanging="360"/>
+      </w:pPr>
+      <w:rPr>
+        <w:rFonts w:ascii="Wingdings" w:hAnsi="Wingdings" w:hint="default"/>
+        <w:sz w:val="20"/>
+      </w:rPr>
+    </w:lvl>
+    <w:lvl w:ilvl="4" w:tentative="1">
+      <w:start w:val="1"/>
+      <w:numFmt w:val="bullet"/>
+      <w:lvlText w:val=""/>
+      <w:lvlJc w:val="left"/>
+      <w:pPr>
+        <w:tabs>
+          <w:tab w:val="num" w:pos="3600"/>
+        </w:tabs>
+        <w:ind w:left="3600" w:hanging="360"/>
+      </w:pPr>
+      <w:rPr>
+        <w:rFonts w:ascii="Wingdings" w:hAnsi="Wingdings" w:hint="default"/>
+        <w:sz w:val="20"/>
+      </w:rPr>
+    </w:lvl>
+    <w:lvl w:ilvl="5" w:tentative="1">
+      <w:start w:val="1"/>
+      <w:numFmt w:val="bullet"/>
+      <w:lvlText w:val=""/>
+      <w:lvlJc w:val="left"/>
+      <w:pPr>
+        <w:tabs>
+          <w:tab w:val="num" w:pos="4320"/>
+        </w:tabs>
+        <w:ind w:left="4320" w:hanging="360"/>
+      </w:pPr>
+      <w:rPr>
+        <w:rFonts w:ascii="Wingdings" w:hAnsi="Wingdings" w:hint="default"/>
+        <w:sz w:val="20"/>
+      </w:rPr>
+    </w:lvl>
+    <w:lvl w:ilvl="6" w:tentative="1">
+      <w:start w:val="1"/>
+      <w:numFmt w:val="bullet"/>
+      <w:lvlText w:val=""/>
+      <w:lvlJc w:val="left"/>
+      <w:pPr>
+        <w:tabs>
+          <w:tab w:val="num" w:pos="5040"/>
+        </w:tabs>
+        <w:ind w:left="5040" w:hanging="360"/>
+      </w:pPr>
+      <w:rPr>
+        <w:rFonts w:ascii="Wingdings" w:hAnsi="Wingdings" w:hint="default"/>
+        <w:sz w:val="20"/>
+      </w:rPr>
+    </w:lvl>
+    <w:lvl w:ilvl="7" w:tentative="1">
+      <w:start w:val="1"/>
+      <w:numFmt w:val="bullet"/>
+      <w:lvlText w:val=""/>
+      <w:lvlJc w:val="left"/>
+      <w:pPr>
+        <w:tabs>
+          <w:tab w:val="num" w:pos="5760"/>
+        </w:tabs>
+        <w:ind w:left="5760" w:hanging="360"/>
+      </w:pPr>
+      <w:rPr>
+        <w:rFonts w:ascii="Wingdings" w:hAnsi="Wingdings" w:hint="default"/>
+        <w:sz w:val="20"/>
+      </w:rPr>
+    </w:lvl>
+    <w:lvl w:ilvl="8" w:tentative="1">
+      <w:start w:val="1"/>
+      <w:numFmt w:val="bullet"/>
+      <w:lvlText w:val=""/>
+      <w:lvlJc w:val="left"/>
+      <w:pPr>
+        <w:tabs>
+          <w:tab w:val="num" w:pos="6480"/>
+        </w:tabs>
+        <w:ind w:left="6480" w:hanging="360"/>
+      </w:pPr>
+      <w:rPr>
+        <w:rFonts w:ascii="Wingdings" w:hAnsi="Wingdings" w:hint="default"/>
+        <w:sz w:val="20"/>
+      </w:rPr>
+    </w:lvl>
+  </w:abstractNum>
+  <w:abstractNum w:abstractNumId="4" w15:restartNumberingAfterBreak="0">
     <w:nsid w:val="28FD2B98"/>
     <w:multiLevelType w:val="multilevel"/>
     <w:tmpl w:val="4A588A9A"/>
@@ -2267,7 +5493,305 @@
       </w:rPr>
     </w:lvl>
   </w:abstractNum>
-  <w:abstractNum w:abstractNumId="2" w15:restartNumberingAfterBreak="0">
+  <w:abstractNum w:abstractNumId="5" w15:restartNumberingAfterBreak="0">
+    <w:nsid w:val="35CD39ED"/>
+    <w:multiLevelType w:val="multilevel"/>
+    <w:tmpl w:val="D06699AA"/>
+    <w:lvl w:ilvl="0">
+      <w:start w:val="1"/>
+      <w:numFmt w:val="bullet"/>
+      <w:lvlText w:val=""/>
+      <w:lvlJc w:val="left"/>
+      <w:pPr>
+        <w:tabs>
+          <w:tab w:val="num" w:pos="720"/>
+        </w:tabs>
+        <w:ind w:left="720" w:hanging="360"/>
+      </w:pPr>
+      <w:rPr>
+        <w:rFonts w:ascii="Symbol" w:hAnsi="Symbol" w:hint="default"/>
+        <w:sz w:val="20"/>
+      </w:rPr>
+    </w:lvl>
+    <w:lvl w:ilvl="1" w:tentative="1">
+      <w:start w:val="1"/>
+      <w:numFmt w:val="bullet"/>
+      <w:lvlText w:val="o"/>
+      <w:lvlJc w:val="left"/>
+      <w:pPr>
+        <w:tabs>
+          <w:tab w:val="num" w:pos="1440"/>
+        </w:tabs>
+        <w:ind w:left="1440" w:hanging="360"/>
+      </w:pPr>
+      <w:rPr>
+        <w:rFonts w:ascii="Courier New" w:hAnsi="Courier New" w:hint="default"/>
+        <w:sz w:val="20"/>
+      </w:rPr>
+    </w:lvl>
+    <w:lvl w:ilvl="2" w:tentative="1">
+      <w:start w:val="1"/>
+      <w:numFmt w:val="bullet"/>
+      <w:lvlText w:val=""/>
+      <w:lvlJc w:val="left"/>
+      <w:pPr>
+        <w:tabs>
+          <w:tab w:val="num" w:pos="2160"/>
+        </w:tabs>
+        <w:ind w:left="2160" w:hanging="360"/>
+      </w:pPr>
+      <w:rPr>
+        <w:rFonts w:ascii="Wingdings" w:hAnsi="Wingdings" w:hint="default"/>
+        <w:sz w:val="20"/>
+      </w:rPr>
+    </w:lvl>
+    <w:lvl w:ilvl="3" w:tentative="1">
+      <w:start w:val="1"/>
+      <w:numFmt w:val="bullet"/>
+      <w:lvlText w:val=""/>
+      <w:lvlJc w:val="left"/>
+      <w:pPr>
+        <w:tabs>
+          <w:tab w:val="num" w:pos="2880"/>
+        </w:tabs>
+        <w:ind w:left="2880" w:hanging="360"/>
+      </w:pPr>
+      <w:rPr>
+        <w:rFonts w:ascii="Wingdings" w:hAnsi="Wingdings" w:hint="default"/>
+        <w:sz w:val="20"/>
+      </w:rPr>
+    </w:lvl>
+    <w:lvl w:ilvl="4" w:tentative="1">
+      <w:start w:val="1"/>
+      <w:numFmt w:val="bullet"/>
+      <w:lvlText w:val=""/>
+      <w:lvlJc w:val="left"/>
+      <w:pPr>
+        <w:tabs>
+          <w:tab w:val="num" w:pos="3600"/>
+        </w:tabs>
+        <w:ind w:left="3600" w:hanging="360"/>
+      </w:pPr>
+      <w:rPr>
+        <w:rFonts w:ascii="Wingdings" w:hAnsi="Wingdings" w:hint="default"/>
+        <w:sz w:val="20"/>
+      </w:rPr>
+    </w:lvl>
+    <w:lvl w:ilvl="5" w:tentative="1">
+      <w:start w:val="1"/>
+      <w:numFmt w:val="bullet"/>
+      <w:lvlText w:val=""/>
+      <w:lvlJc w:val="left"/>
+      <w:pPr>
+        <w:tabs>
+          <w:tab w:val="num" w:pos="4320"/>
+        </w:tabs>
+        <w:ind w:left="4320" w:hanging="360"/>
+      </w:pPr>
+      <w:rPr>
+        <w:rFonts w:ascii="Wingdings" w:hAnsi="Wingdings" w:hint="default"/>
+        <w:sz w:val="20"/>
+      </w:rPr>
+    </w:lvl>
+    <w:lvl w:ilvl="6" w:tentative="1">
+      <w:start w:val="1"/>
+      <w:numFmt w:val="bullet"/>
+      <w:lvlText w:val=""/>
+      <w:lvlJc w:val="left"/>
+      <w:pPr>
+        <w:tabs>
+          <w:tab w:val="num" w:pos="5040"/>
+        </w:tabs>
+        <w:ind w:left="5040" w:hanging="360"/>
+      </w:pPr>
+      <w:rPr>
+        <w:rFonts w:ascii="Wingdings" w:hAnsi="Wingdings" w:hint="default"/>
+        <w:sz w:val="20"/>
+      </w:rPr>
+    </w:lvl>
+    <w:lvl w:ilvl="7" w:tentative="1">
+      <w:start w:val="1"/>
+      <w:numFmt w:val="bullet"/>
+      <w:lvlText w:val=""/>
+      <w:lvlJc w:val="left"/>
+      <w:pPr>
+        <w:tabs>
+          <w:tab w:val="num" w:pos="5760"/>
+        </w:tabs>
+        <w:ind w:left="5760" w:hanging="360"/>
+      </w:pPr>
+      <w:rPr>
+        <w:rFonts w:ascii="Wingdings" w:hAnsi="Wingdings" w:hint="default"/>
+        <w:sz w:val="20"/>
+      </w:rPr>
+    </w:lvl>
+    <w:lvl w:ilvl="8" w:tentative="1">
+      <w:start w:val="1"/>
+      <w:numFmt w:val="bullet"/>
+      <w:lvlText w:val=""/>
+      <w:lvlJc w:val="left"/>
+      <w:pPr>
+        <w:tabs>
+          <w:tab w:val="num" w:pos="6480"/>
+        </w:tabs>
+        <w:ind w:left="6480" w:hanging="360"/>
+      </w:pPr>
+      <w:rPr>
+        <w:rFonts w:ascii="Wingdings" w:hAnsi="Wingdings" w:hint="default"/>
+        <w:sz w:val="20"/>
+      </w:rPr>
+    </w:lvl>
+  </w:abstractNum>
+  <w:abstractNum w:abstractNumId="6" w15:restartNumberingAfterBreak="0">
+    <w:nsid w:val="4E7D564E"/>
+    <w:multiLevelType w:val="multilevel"/>
+    <w:tmpl w:val="5BAE90C4"/>
+    <w:lvl w:ilvl="0">
+      <w:start w:val="1"/>
+      <w:numFmt w:val="bullet"/>
+      <w:lvlText w:val=""/>
+      <w:lvlJc w:val="left"/>
+      <w:pPr>
+        <w:tabs>
+          <w:tab w:val="num" w:pos="720"/>
+        </w:tabs>
+        <w:ind w:left="720" w:hanging="360"/>
+      </w:pPr>
+      <w:rPr>
+        <w:rFonts w:ascii="Symbol" w:hAnsi="Symbol" w:hint="default"/>
+        <w:sz w:val="20"/>
+      </w:rPr>
+    </w:lvl>
+    <w:lvl w:ilvl="1" w:tentative="1">
+      <w:start w:val="1"/>
+      <w:numFmt w:val="bullet"/>
+      <w:lvlText w:val="o"/>
+      <w:lvlJc w:val="left"/>
+      <w:pPr>
+        <w:tabs>
+          <w:tab w:val="num" w:pos="1440"/>
+        </w:tabs>
+        <w:ind w:left="1440" w:hanging="360"/>
+      </w:pPr>
+      <w:rPr>
+        <w:rFonts w:ascii="Courier New" w:hAnsi="Courier New" w:hint="default"/>
+        <w:sz w:val="20"/>
+      </w:rPr>
+    </w:lvl>
+    <w:lvl w:ilvl="2" w:tentative="1">
+      <w:start w:val="1"/>
+      <w:numFmt w:val="bullet"/>
+      <w:lvlText w:val=""/>
+      <w:lvlJc w:val="left"/>
+      <w:pPr>
+        <w:tabs>
+          <w:tab w:val="num" w:pos="2160"/>
+        </w:tabs>
+        <w:ind w:left="2160" w:hanging="360"/>
+      </w:pPr>
+      <w:rPr>
+        <w:rFonts w:ascii="Wingdings" w:hAnsi="Wingdings" w:hint="default"/>
+        <w:sz w:val="20"/>
+      </w:rPr>
+    </w:lvl>
+    <w:lvl w:ilvl="3" w:tentative="1">
+      <w:start w:val="1"/>
+      <w:numFmt w:val="bullet"/>
+      <w:lvlText w:val=""/>
+      <w:lvlJc w:val="left"/>
+      <w:pPr>
+        <w:tabs>
+          <w:tab w:val="num" w:pos="2880"/>
+        </w:tabs>
+        <w:ind w:left="2880" w:hanging="360"/>
+      </w:pPr>
+      <w:rPr>
+        <w:rFonts w:ascii="Wingdings" w:hAnsi="Wingdings" w:hint="default"/>
+        <w:sz w:val="20"/>
+      </w:rPr>
+    </w:lvl>
+    <w:lvl w:ilvl="4" w:tentative="1">
+      <w:start w:val="1"/>
+      <w:numFmt w:val="bullet"/>
+      <w:lvlText w:val=""/>
+      <w:lvlJc w:val="left"/>
+      <w:pPr>
+        <w:tabs>
+          <w:tab w:val="num" w:pos="3600"/>
+        </w:tabs>
+        <w:ind w:left="3600" w:hanging="360"/>
+      </w:pPr>
+      <w:rPr>
+        <w:rFonts w:ascii="Wingdings" w:hAnsi="Wingdings" w:hint="default"/>
+        <w:sz w:val="20"/>
+      </w:rPr>
+    </w:lvl>
+    <w:lvl w:ilvl="5" w:tentative="1">
+      <w:start w:val="1"/>
+      <w:numFmt w:val="bullet"/>
+      <w:lvlText w:val=""/>
+      <w:lvlJc w:val="left"/>
+      <w:pPr>
+        <w:tabs>
+          <w:tab w:val="num" w:pos="4320"/>
+        </w:tabs>
+        <w:ind w:left="4320" w:hanging="360"/>
+      </w:pPr>
+      <w:rPr>
+        <w:rFonts w:ascii="Wingdings" w:hAnsi="Wingdings" w:hint="default"/>
+        <w:sz w:val="20"/>
+      </w:rPr>
+    </w:lvl>
+    <w:lvl w:ilvl="6" w:tentative="1">
+      <w:start w:val="1"/>
+      <w:numFmt w:val="bullet"/>
+      <w:lvlText w:val=""/>
+      <w:lvlJc w:val="left"/>
+      <w:pPr>
+        <w:tabs>
+          <w:tab w:val="num" w:pos="5040"/>
+        </w:tabs>
+        <w:ind w:left="5040" w:hanging="360"/>
+      </w:pPr>
+      <w:rPr>
+        <w:rFonts w:ascii="Wingdings" w:hAnsi="Wingdings" w:hint="default"/>
+        <w:sz w:val="20"/>
+      </w:rPr>
+    </w:lvl>
+    <w:lvl w:ilvl="7" w:tentative="1">
+      <w:start w:val="1"/>
+      <w:numFmt w:val="bullet"/>
+      <w:lvlText w:val=""/>
+      <w:lvlJc w:val="left"/>
+      <w:pPr>
+        <w:tabs>
+          <w:tab w:val="num" w:pos="5760"/>
+        </w:tabs>
+        <w:ind w:left="5760" w:hanging="360"/>
+      </w:pPr>
+      <w:rPr>
+        <w:rFonts w:ascii="Wingdings" w:hAnsi="Wingdings" w:hint="default"/>
+        <w:sz w:val="20"/>
+      </w:rPr>
+    </w:lvl>
+    <w:lvl w:ilvl="8" w:tentative="1">
+      <w:start w:val="1"/>
+      <w:numFmt w:val="bullet"/>
+      <w:lvlText w:val=""/>
+      <w:lvlJc w:val="left"/>
+      <w:pPr>
+        <w:tabs>
+          <w:tab w:val="num" w:pos="6480"/>
+        </w:tabs>
+        <w:ind w:left="6480" w:hanging="360"/>
+      </w:pPr>
+      <w:rPr>
+        <w:rFonts w:ascii="Wingdings" w:hAnsi="Wingdings" w:hint="default"/>
+        <w:sz w:val="20"/>
+      </w:rPr>
+    </w:lvl>
+  </w:abstractNum>
+  <w:abstractNum w:abstractNumId="7" w15:restartNumberingAfterBreak="0">
     <w:nsid w:val="52875E96"/>
     <w:multiLevelType w:val="multilevel"/>
     <w:tmpl w:val="D42A058A"/>
@@ -2416,7 +5940,454 @@
       </w:rPr>
     </w:lvl>
   </w:abstractNum>
-  <w:abstractNum w:abstractNumId="3" w15:restartNumberingAfterBreak="0">
+  <w:abstractNum w:abstractNumId="8" w15:restartNumberingAfterBreak="0">
+    <w:nsid w:val="5577765D"/>
+    <w:multiLevelType w:val="multilevel"/>
+    <w:tmpl w:val="2F02E3AA"/>
+    <w:lvl w:ilvl="0">
+      <w:start w:val="1"/>
+      <w:numFmt w:val="bullet"/>
+      <w:lvlText w:val=""/>
+      <w:lvlJc w:val="left"/>
+      <w:pPr>
+        <w:tabs>
+          <w:tab w:val="num" w:pos="720"/>
+        </w:tabs>
+        <w:ind w:left="720" w:hanging="360"/>
+      </w:pPr>
+      <w:rPr>
+        <w:rFonts w:ascii="Symbol" w:hAnsi="Symbol" w:hint="default"/>
+        <w:sz w:val="20"/>
+      </w:rPr>
+    </w:lvl>
+    <w:lvl w:ilvl="1" w:tentative="1">
+      <w:start w:val="1"/>
+      <w:numFmt w:val="bullet"/>
+      <w:lvlText w:val="o"/>
+      <w:lvlJc w:val="left"/>
+      <w:pPr>
+        <w:tabs>
+          <w:tab w:val="num" w:pos="1440"/>
+        </w:tabs>
+        <w:ind w:left="1440" w:hanging="360"/>
+      </w:pPr>
+      <w:rPr>
+        <w:rFonts w:ascii="Courier New" w:hAnsi="Courier New" w:hint="default"/>
+        <w:sz w:val="20"/>
+      </w:rPr>
+    </w:lvl>
+    <w:lvl w:ilvl="2" w:tentative="1">
+      <w:start w:val="1"/>
+      <w:numFmt w:val="bullet"/>
+      <w:lvlText w:val=""/>
+      <w:lvlJc w:val="left"/>
+      <w:pPr>
+        <w:tabs>
+          <w:tab w:val="num" w:pos="2160"/>
+        </w:tabs>
+        <w:ind w:left="2160" w:hanging="360"/>
+      </w:pPr>
+      <w:rPr>
+        <w:rFonts w:ascii="Wingdings" w:hAnsi="Wingdings" w:hint="default"/>
+        <w:sz w:val="20"/>
+      </w:rPr>
+    </w:lvl>
+    <w:lvl w:ilvl="3" w:tentative="1">
+      <w:start w:val="1"/>
+      <w:numFmt w:val="bullet"/>
+      <w:lvlText w:val=""/>
+      <w:lvlJc w:val="left"/>
+      <w:pPr>
+        <w:tabs>
+          <w:tab w:val="num" w:pos="2880"/>
+        </w:tabs>
+        <w:ind w:left="2880" w:hanging="360"/>
+      </w:pPr>
+      <w:rPr>
+        <w:rFonts w:ascii="Wingdings" w:hAnsi="Wingdings" w:hint="default"/>
+        <w:sz w:val="20"/>
+      </w:rPr>
+    </w:lvl>
+    <w:lvl w:ilvl="4" w:tentative="1">
+      <w:start w:val="1"/>
+      <w:numFmt w:val="bullet"/>
+      <w:lvlText w:val=""/>
+      <w:lvlJc w:val="left"/>
+      <w:pPr>
+        <w:tabs>
+          <w:tab w:val="num" w:pos="3600"/>
+        </w:tabs>
+        <w:ind w:left="3600" w:hanging="360"/>
+      </w:pPr>
+      <w:rPr>
+        <w:rFonts w:ascii="Wingdings" w:hAnsi="Wingdings" w:hint="default"/>
+        <w:sz w:val="20"/>
+      </w:rPr>
+    </w:lvl>
+    <w:lvl w:ilvl="5" w:tentative="1">
+      <w:start w:val="1"/>
+      <w:numFmt w:val="bullet"/>
+      <w:lvlText w:val=""/>
+      <w:lvlJc w:val="left"/>
+      <w:pPr>
+        <w:tabs>
+          <w:tab w:val="num" w:pos="4320"/>
+        </w:tabs>
+        <w:ind w:left="4320" w:hanging="360"/>
+      </w:pPr>
+      <w:rPr>
+        <w:rFonts w:ascii="Wingdings" w:hAnsi="Wingdings" w:hint="default"/>
+        <w:sz w:val="20"/>
+      </w:rPr>
+    </w:lvl>
+    <w:lvl w:ilvl="6" w:tentative="1">
+      <w:start w:val="1"/>
+      <w:numFmt w:val="bullet"/>
+      <w:lvlText w:val=""/>
+      <w:lvlJc w:val="left"/>
+      <w:pPr>
+        <w:tabs>
+          <w:tab w:val="num" w:pos="5040"/>
+        </w:tabs>
+        <w:ind w:left="5040" w:hanging="360"/>
+      </w:pPr>
+      <w:rPr>
+        <w:rFonts w:ascii="Wingdings" w:hAnsi="Wingdings" w:hint="default"/>
+        <w:sz w:val="20"/>
+      </w:rPr>
+    </w:lvl>
+    <w:lvl w:ilvl="7" w:tentative="1">
+      <w:start w:val="1"/>
+      <w:numFmt w:val="bullet"/>
+      <w:lvlText w:val=""/>
+      <w:lvlJc w:val="left"/>
+      <w:pPr>
+        <w:tabs>
+          <w:tab w:val="num" w:pos="5760"/>
+        </w:tabs>
+        <w:ind w:left="5760" w:hanging="360"/>
+      </w:pPr>
+      <w:rPr>
+        <w:rFonts w:ascii="Wingdings" w:hAnsi="Wingdings" w:hint="default"/>
+        <w:sz w:val="20"/>
+      </w:rPr>
+    </w:lvl>
+    <w:lvl w:ilvl="8" w:tentative="1">
+      <w:start w:val="1"/>
+      <w:numFmt w:val="bullet"/>
+      <w:lvlText w:val=""/>
+      <w:lvlJc w:val="left"/>
+      <w:pPr>
+        <w:tabs>
+          <w:tab w:val="num" w:pos="6480"/>
+        </w:tabs>
+        <w:ind w:left="6480" w:hanging="360"/>
+      </w:pPr>
+      <w:rPr>
+        <w:rFonts w:ascii="Wingdings" w:hAnsi="Wingdings" w:hint="default"/>
+        <w:sz w:val="20"/>
+      </w:rPr>
+    </w:lvl>
+  </w:abstractNum>
+  <w:abstractNum w:abstractNumId="9" w15:restartNumberingAfterBreak="0">
+    <w:nsid w:val="57884AD3"/>
+    <w:multiLevelType w:val="multilevel"/>
+    <w:tmpl w:val="A684ADDC"/>
+    <w:lvl w:ilvl="0">
+      <w:start w:val="1"/>
+      <w:numFmt w:val="bullet"/>
+      <w:lvlText w:val=""/>
+      <w:lvlJc w:val="left"/>
+      <w:pPr>
+        <w:tabs>
+          <w:tab w:val="num" w:pos="720"/>
+        </w:tabs>
+        <w:ind w:left="720" w:hanging="360"/>
+      </w:pPr>
+      <w:rPr>
+        <w:rFonts w:ascii="Symbol" w:hAnsi="Symbol" w:hint="default"/>
+        <w:sz w:val="20"/>
+      </w:rPr>
+    </w:lvl>
+    <w:lvl w:ilvl="1" w:tentative="1">
+      <w:start w:val="1"/>
+      <w:numFmt w:val="bullet"/>
+      <w:lvlText w:val="o"/>
+      <w:lvlJc w:val="left"/>
+      <w:pPr>
+        <w:tabs>
+          <w:tab w:val="num" w:pos="1440"/>
+        </w:tabs>
+        <w:ind w:left="1440" w:hanging="360"/>
+      </w:pPr>
+      <w:rPr>
+        <w:rFonts w:ascii="Courier New" w:hAnsi="Courier New" w:hint="default"/>
+        <w:sz w:val="20"/>
+      </w:rPr>
+    </w:lvl>
+    <w:lvl w:ilvl="2" w:tentative="1">
+      <w:start w:val="1"/>
+      <w:numFmt w:val="bullet"/>
+      <w:lvlText w:val=""/>
+      <w:lvlJc w:val="left"/>
+      <w:pPr>
+        <w:tabs>
+          <w:tab w:val="num" w:pos="2160"/>
+        </w:tabs>
+        <w:ind w:left="2160" w:hanging="360"/>
+      </w:pPr>
+      <w:rPr>
+        <w:rFonts w:ascii="Wingdings" w:hAnsi="Wingdings" w:hint="default"/>
+        <w:sz w:val="20"/>
+      </w:rPr>
+    </w:lvl>
+    <w:lvl w:ilvl="3" w:tentative="1">
+      <w:start w:val="1"/>
+      <w:numFmt w:val="bullet"/>
+      <w:lvlText w:val=""/>
+      <w:lvlJc w:val="left"/>
+      <w:pPr>
+        <w:tabs>
+          <w:tab w:val="num" w:pos="2880"/>
+        </w:tabs>
+        <w:ind w:left="2880" w:hanging="360"/>
+      </w:pPr>
+      <w:rPr>
+        <w:rFonts w:ascii="Wingdings" w:hAnsi="Wingdings" w:hint="default"/>
+        <w:sz w:val="20"/>
+      </w:rPr>
+    </w:lvl>
+    <w:lvl w:ilvl="4" w:tentative="1">
+      <w:start w:val="1"/>
+      <w:numFmt w:val="bullet"/>
+      <w:lvlText w:val=""/>
+      <w:lvlJc w:val="left"/>
+      <w:pPr>
+        <w:tabs>
+          <w:tab w:val="num" w:pos="3600"/>
+        </w:tabs>
+        <w:ind w:left="3600" w:hanging="360"/>
+      </w:pPr>
+      <w:rPr>
+        <w:rFonts w:ascii="Wingdings" w:hAnsi="Wingdings" w:hint="default"/>
+        <w:sz w:val="20"/>
+      </w:rPr>
+    </w:lvl>
+    <w:lvl w:ilvl="5" w:tentative="1">
+      <w:start w:val="1"/>
+      <w:numFmt w:val="bullet"/>
+      <w:lvlText w:val=""/>
+      <w:lvlJc w:val="left"/>
+      <w:pPr>
+        <w:tabs>
+          <w:tab w:val="num" w:pos="4320"/>
+        </w:tabs>
+        <w:ind w:left="4320" w:hanging="360"/>
+      </w:pPr>
+      <w:rPr>
+        <w:rFonts w:ascii="Wingdings" w:hAnsi="Wingdings" w:hint="default"/>
+        <w:sz w:val="20"/>
+      </w:rPr>
+    </w:lvl>
+    <w:lvl w:ilvl="6" w:tentative="1">
+      <w:start w:val="1"/>
+      <w:numFmt w:val="bullet"/>
+      <w:lvlText w:val=""/>
+      <w:lvlJc w:val="left"/>
+      <w:pPr>
+        <w:tabs>
+          <w:tab w:val="num" w:pos="5040"/>
+        </w:tabs>
+        <w:ind w:left="5040" w:hanging="360"/>
+      </w:pPr>
+      <w:rPr>
+        <w:rFonts w:ascii="Wingdings" w:hAnsi="Wingdings" w:hint="default"/>
+        <w:sz w:val="20"/>
+      </w:rPr>
+    </w:lvl>
+    <w:lvl w:ilvl="7" w:tentative="1">
+      <w:start w:val="1"/>
+      <w:numFmt w:val="bullet"/>
+      <w:lvlText w:val=""/>
+      <w:lvlJc w:val="left"/>
+      <w:pPr>
+        <w:tabs>
+          <w:tab w:val="num" w:pos="5760"/>
+        </w:tabs>
+        <w:ind w:left="5760" w:hanging="360"/>
+      </w:pPr>
+      <w:rPr>
+        <w:rFonts w:ascii="Wingdings" w:hAnsi="Wingdings" w:hint="default"/>
+        <w:sz w:val="20"/>
+      </w:rPr>
+    </w:lvl>
+    <w:lvl w:ilvl="8" w:tentative="1">
+      <w:start w:val="1"/>
+      <w:numFmt w:val="bullet"/>
+      <w:lvlText w:val=""/>
+      <w:lvlJc w:val="left"/>
+      <w:pPr>
+        <w:tabs>
+          <w:tab w:val="num" w:pos="6480"/>
+        </w:tabs>
+        <w:ind w:left="6480" w:hanging="360"/>
+      </w:pPr>
+      <w:rPr>
+        <w:rFonts w:ascii="Wingdings" w:hAnsi="Wingdings" w:hint="default"/>
+        <w:sz w:val="20"/>
+      </w:rPr>
+    </w:lvl>
+  </w:abstractNum>
+  <w:abstractNum w:abstractNumId="10" w15:restartNumberingAfterBreak="0">
+    <w:nsid w:val="5B337F77"/>
+    <w:multiLevelType w:val="multilevel"/>
+    <w:tmpl w:val="8C7E52E2"/>
+    <w:lvl w:ilvl="0">
+      <w:start w:val="1"/>
+      <w:numFmt w:val="bullet"/>
+      <w:lvlText w:val=""/>
+      <w:lvlJc w:val="left"/>
+      <w:pPr>
+        <w:tabs>
+          <w:tab w:val="num" w:pos="720"/>
+        </w:tabs>
+        <w:ind w:left="720" w:hanging="360"/>
+      </w:pPr>
+      <w:rPr>
+        <w:rFonts w:ascii="Symbol" w:hAnsi="Symbol" w:hint="default"/>
+        <w:sz w:val="20"/>
+      </w:rPr>
+    </w:lvl>
+    <w:lvl w:ilvl="1">
+      <w:start w:val="1"/>
+      <w:numFmt w:val="bullet"/>
+      <w:lvlText w:val="o"/>
+      <w:lvlJc w:val="left"/>
+      <w:pPr>
+        <w:tabs>
+          <w:tab w:val="num" w:pos="1440"/>
+        </w:tabs>
+        <w:ind w:left="1440" w:hanging="360"/>
+      </w:pPr>
+      <w:rPr>
+        <w:rFonts w:ascii="Courier New" w:hAnsi="Courier New" w:hint="default"/>
+        <w:sz w:val="20"/>
+      </w:rPr>
+    </w:lvl>
+    <w:lvl w:ilvl="2" w:tentative="1">
+      <w:start w:val="1"/>
+      <w:numFmt w:val="bullet"/>
+      <w:lvlText w:val=""/>
+      <w:lvlJc w:val="left"/>
+      <w:pPr>
+        <w:tabs>
+          <w:tab w:val="num" w:pos="2160"/>
+        </w:tabs>
+        <w:ind w:left="2160" w:hanging="360"/>
+      </w:pPr>
+      <w:rPr>
+        <w:rFonts w:ascii="Wingdings" w:hAnsi="Wingdings" w:hint="default"/>
+        <w:sz w:val="20"/>
+      </w:rPr>
+    </w:lvl>
+    <w:lvl w:ilvl="3" w:tentative="1">
+      <w:start w:val="1"/>
+      <w:numFmt w:val="bullet"/>
+      <w:lvlText w:val=""/>
+      <w:lvlJc w:val="left"/>
+      <w:pPr>
+        <w:tabs>
+          <w:tab w:val="num" w:pos="2880"/>
+        </w:tabs>
+        <w:ind w:left="2880" w:hanging="360"/>
+      </w:pPr>
+      <w:rPr>
+        <w:rFonts w:ascii="Wingdings" w:hAnsi="Wingdings" w:hint="default"/>
+        <w:sz w:val="20"/>
+      </w:rPr>
+    </w:lvl>
+    <w:lvl w:ilvl="4" w:tentative="1">
+      <w:start w:val="1"/>
+      <w:numFmt w:val="bullet"/>
+      <w:lvlText w:val=""/>
+      <w:lvlJc w:val="left"/>
+      <w:pPr>
+        <w:tabs>
+          <w:tab w:val="num" w:pos="3600"/>
+        </w:tabs>
+        <w:ind w:left="3600" w:hanging="360"/>
+      </w:pPr>
+      <w:rPr>
+        <w:rFonts w:ascii="Wingdings" w:hAnsi="Wingdings" w:hint="default"/>
+        <w:sz w:val="20"/>
+      </w:rPr>
+    </w:lvl>
+    <w:lvl w:ilvl="5" w:tentative="1">
+      <w:start w:val="1"/>
+      <w:numFmt w:val="bullet"/>
+      <w:lvlText w:val=""/>
+      <w:lvlJc w:val="left"/>
+      <w:pPr>
+        <w:tabs>
+          <w:tab w:val="num" w:pos="4320"/>
+        </w:tabs>
+        <w:ind w:left="4320" w:hanging="360"/>
+      </w:pPr>
+      <w:rPr>
+        <w:rFonts w:ascii="Wingdings" w:hAnsi="Wingdings" w:hint="default"/>
+        <w:sz w:val="20"/>
+      </w:rPr>
+    </w:lvl>
+    <w:lvl w:ilvl="6" w:tentative="1">
+      <w:start w:val="1"/>
+      <w:numFmt w:val="bullet"/>
+      <w:lvlText w:val=""/>
+      <w:lvlJc w:val="left"/>
+      <w:pPr>
+        <w:tabs>
+          <w:tab w:val="num" w:pos="5040"/>
+        </w:tabs>
+        <w:ind w:left="5040" w:hanging="360"/>
+      </w:pPr>
+      <w:rPr>
+        <w:rFonts w:ascii="Wingdings" w:hAnsi="Wingdings" w:hint="default"/>
+        <w:sz w:val="20"/>
+      </w:rPr>
+    </w:lvl>
+    <w:lvl w:ilvl="7" w:tentative="1">
+      <w:start w:val="1"/>
+      <w:numFmt w:val="bullet"/>
+      <w:lvlText w:val=""/>
+      <w:lvlJc w:val="left"/>
+      <w:pPr>
+        <w:tabs>
+          <w:tab w:val="num" w:pos="5760"/>
+        </w:tabs>
+        <w:ind w:left="5760" w:hanging="360"/>
+      </w:pPr>
+      <w:rPr>
+        <w:rFonts w:ascii="Wingdings" w:hAnsi="Wingdings" w:hint="default"/>
+        <w:sz w:val="20"/>
+      </w:rPr>
+    </w:lvl>
+    <w:lvl w:ilvl="8" w:tentative="1">
+      <w:start w:val="1"/>
+      <w:numFmt w:val="bullet"/>
+      <w:lvlText w:val=""/>
+      <w:lvlJc w:val="left"/>
+      <w:pPr>
+        <w:tabs>
+          <w:tab w:val="num" w:pos="6480"/>
+        </w:tabs>
+        <w:ind w:left="6480" w:hanging="360"/>
+      </w:pPr>
+      <w:rPr>
+        <w:rFonts w:ascii="Wingdings" w:hAnsi="Wingdings" w:hint="default"/>
+        <w:sz w:val="20"/>
+      </w:rPr>
+    </w:lvl>
+  </w:abstractNum>
+  <w:abstractNum w:abstractNumId="11" w15:restartNumberingAfterBreak="0">
     <w:nsid w:val="61A4293F"/>
     <w:multiLevelType w:val="multilevel"/>
     <w:tmpl w:val="1C2AD994"/>
@@ -2565,7 +6536,7 @@
       </w:rPr>
     </w:lvl>
   </w:abstractNum>
-  <w:abstractNum w:abstractNumId="4" w15:restartNumberingAfterBreak="0">
+  <w:abstractNum w:abstractNumId="12" w15:restartNumberingAfterBreak="0">
     <w:nsid w:val="61D97C25"/>
     <w:multiLevelType w:val="multilevel"/>
     <w:tmpl w:val="B40CCBA0"/>
@@ -2714,7 +6685,7 @@
       </w:rPr>
     </w:lvl>
   </w:abstractNum>
-  <w:abstractNum w:abstractNumId="5" w15:restartNumberingAfterBreak="0">
+  <w:abstractNum w:abstractNumId="13" w15:restartNumberingAfterBreak="0">
     <w:nsid w:val="745110A6"/>
     <w:multiLevelType w:val="multilevel"/>
     <w:tmpl w:val="EC028626"/>
@@ -2864,22 +6835,46 @@
     </w:lvl>
   </w:abstractNum>
   <w:num w:numId="1">
+    <w:abstractNumId w:val="13"/>
+  </w:num>
+  <w:num w:numId="2">
+    <w:abstractNumId w:val="11"/>
+  </w:num>
+  <w:num w:numId="3">
+    <w:abstractNumId w:val="12"/>
+  </w:num>
+  <w:num w:numId="4">
+    <w:abstractNumId w:val="2"/>
+  </w:num>
+  <w:num w:numId="5">
+    <w:abstractNumId w:val="4"/>
+  </w:num>
+  <w:num w:numId="6">
+    <w:abstractNumId w:val="7"/>
+  </w:num>
+  <w:num w:numId="7">
+    <w:abstractNumId w:val="10"/>
+  </w:num>
+  <w:num w:numId="8">
+    <w:abstractNumId w:val="0"/>
+  </w:num>
+  <w:num w:numId="9">
+    <w:abstractNumId w:val="8"/>
+  </w:num>
+  <w:num w:numId="10">
     <w:abstractNumId w:val="5"/>
   </w:num>
-  <w:num w:numId="2">
-    <w:abstractNumId w:val="3"/>
+  <w:num w:numId="11">
+    <w:abstractNumId w:val="6"/>
   </w:num>
-  <w:num w:numId="3">
-    <w:abstractNumId w:val="4"/>
-  </w:num>
-  <w:num w:numId="4">
-    <w:abstractNumId w:val="0"/>
-  </w:num>
-  <w:num w:numId="5">
+  <w:num w:numId="12">
     <w:abstractNumId w:val="1"/>
   </w:num>
-  <w:num w:numId="6">
-    <w:abstractNumId w:val="2"/>
+  <w:num w:numId="13">
+    <w:abstractNumId w:val="9"/>
+  </w:num>
+  <w:num w:numId="14">
+    <w:abstractNumId w:val="3"/>
   </w:num>
 </w:numbering>
 </file>
@@ -3619,6 +7614,11 @@
     <w:basedOn w:val="a0"/>
     <w:rsid w:val="00DC494F"/>
   </w:style>
+  <w:style w:type="character" w:customStyle="1" w:styleId="hljs-builtin">
+    <w:name w:val="hljs-built_in"/>
+    <w:basedOn w:val="a0"/>
+    <w:rsid w:val="00B5535A"/>
+  </w:style>
 </w:styles>
 </file>
 

</xml_diff>